<commit_message>
Fase 4 (Interfaz y calendario)
</commit_message>
<xml_diff>
--- a/docs/Memoria TFM.docx
+++ b/docs/Memoria TFM.docx
@@ -4972,15 +4972,7 @@
         </w:numPr>
       </w:pPr>
       <w:r>
-        <w:t xml:space="preserve">y un apartado específico para Puy du </w:t>
-      </w:r>
-      <w:proofErr w:type="spellStart"/>
-      <w:r>
-        <w:t>Fou</w:t>
-      </w:r>
-      <w:proofErr w:type="spellEnd"/>
-      <w:r>
-        <w:t xml:space="preserve"> España (distancia, tiempos aproximados en coche, tipo de espectáculo).</w:t>
+        <w:t>y un apartado específico para Puy du Fou España (distancia, tiempos aproximados en coche, tipo de espectáculo).</w:t>
       </w:r>
     </w:p>
     <w:p>
@@ -5525,15 +5517,7 @@
     </w:p>
     <w:p>
       <w:r>
-        <w:t>Elección de GPT-4o mini frente a modelos locales (</w:t>
-      </w:r>
-      <w:proofErr w:type="spellStart"/>
-      <w:r>
-        <w:t>Ollama</w:t>
-      </w:r>
-      <w:proofErr w:type="spellEnd"/>
-      <w:r>
-        <w:t>)</w:t>
+        <w:t>Elección de GPT-4o mini frente a modelos locales (Ollama)</w:t>
       </w:r>
       <w:r>
         <w:br/>
@@ -5552,17 +5536,8 @@
           <w:b/>
           <w:bCs/>
         </w:rPr>
-        <w:t xml:space="preserve">Modelos locales vía </w:t>
-      </w:r>
-      <w:proofErr w:type="spellStart"/>
-      <w:r>
-        <w:rPr>
-          <w:b/>
-          <w:bCs/>
-        </w:rPr>
-        <w:t>Ollama</w:t>
-      </w:r>
-      <w:proofErr w:type="spellEnd"/>
+        <w:t>Modelos locales vía Ollama</w:t>
+      </w:r>
       <w:r>
         <w:t xml:space="preserve"> (por ejemplo, Llama 3, Mistral, etc.):</w:t>
       </w:r>
@@ -5777,6 +5752,1821 @@
     <w:p>
       <w:r>
         <w:t>Aunque estos detalles no afectan a la lógica, sí mejoran la percepción de “producto acabado” y ayudan a que la demo sea más fluida para el tribunal.</w:t>
+      </w:r>
+    </w:p>
+    <w:p/>
+    <w:p>
+      <w:pPr>
+        <w:rPr>
+          <w:b/>
+          <w:bCs/>
+        </w:rPr>
+      </w:pPr>
+      <w:r>
+        <w:rPr>
+          <w:b/>
+          <w:bCs/>
+        </w:rPr>
+        <w:t>Fase 1 (seguridad + privacidad) y estabilización: DNI/NIE, verificación de propietario, capa de privacidad e inferencia de año</w:t>
+      </w:r>
+    </w:p>
+    <w:p>
+      <w:pPr>
+        <w:rPr>
+          <w:b/>
+          <w:bCs/>
+        </w:rPr>
+      </w:pPr>
+      <w:r>
+        <w:rPr>
+          <w:b/>
+          <w:bCs/>
+        </w:rPr>
+        <w:t>DNI/NIE como dato obligatorio de reserva (persistencia en Excel)</w:t>
+      </w:r>
+    </w:p>
+    <w:p>
+      <w:r>
+        <w:t xml:space="preserve">Se incorporó </w:t>
+      </w:r>
+      <w:proofErr w:type="spellStart"/>
+      <w:r>
+        <w:rPr>
+          <w:b/>
+          <w:bCs/>
+        </w:rPr>
+        <w:t>cliente_dni</w:t>
+      </w:r>
+      <w:proofErr w:type="spellEnd"/>
+      <w:r>
+        <w:t xml:space="preserve"> (DNI/NIE) como </w:t>
+      </w:r>
+      <w:r>
+        <w:rPr>
+          <w:b/>
+          <w:bCs/>
+        </w:rPr>
+        <w:t>campo obligatorio</w:t>
+      </w:r>
+      <w:r>
+        <w:t xml:space="preserve"> en el flujo de creación de reservas para poder verificar identidad en operaciones sensibles (cancelar/modificar).</w:t>
+      </w:r>
+      <w:r>
+        <w:br/>
+        <w:t xml:space="preserve">A nivel de persistencia, no se exige editar manualmente el Excel: el </w:t>
+      </w:r>
+      <w:proofErr w:type="spellStart"/>
+      <w:r>
+        <w:t>backend</w:t>
+      </w:r>
+      <w:proofErr w:type="spellEnd"/>
+      <w:r>
+        <w:t xml:space="preserve"> garantiza el esquema añadiendo columnas faltantes al vuelo (si reservas.xlsx no tiene </w:t>
+      </w:r>
+      <w:proofErr w:type="spellStart"/>
+      <w:r>
+        <w:t>cliente_dni</w:t>
+      </w:r>
+      <w:proofErr w:type="spellEnd"/>
+      <w:r>
+        <w:t>, se crea con NA/"" al cargar y antes de guardar).</w:t>
+      </w:r>
+    </w:p>
+    <w:p>
+      <w:r>
+        <w:rPr>
+          <w:b/>
+          <w:bCs/>
+        </w:rPr>
+        <w:t>Cambios clave:</w:t>
+      </w:r>
+    </w:p>
+    <w:p>
+      <w:pPr>
+        <w:numPr>
+          <w:ilvl w:val="0"/>
+          <w:numId w:val="40"/>
+        </w:numPr>
+      </w:pPr>
+      <w:r>
+        <w:t xml:space="preserve">REQ_FIELDS incluye </w:t>
+      </w:r>
+      <w:proofErr w:type="spellStart"/>
+      <w:r>
+        <w:t>cliente_dni</w:t>
+      </w:r>
+      <w:proofErr w:type="spellEnd"/>
+      <w:r>
+        <w:t>.</w:t>
+      </w:r>
+    </w:p>
+    <w:p>
+      <w:pPr>
+        <w:numPr>
+          <w:ilvl w:val="0"/>
+          <w:numId w:val="40"/>
+        </w:numPr>
+      </w:pPr>
+      <w:proofErr w:type="spellStart"/>
+      <w:r>
+        <w:t>crear_reserva_excel</w:t>
+      </w:r>
+      <w:proofErr w:type="spellEnd"/>
+      <w:r>
+        <w:t xml:space="preserve">(...) guarda </w:t>
+      </w:r>
+      <w:proofErr w:type="spellStart"/>
+      <w:r>
+        <w:t>cliente_dni</w:t>
+      </w:r>
+      <w:proofErr w:type="spellEnd"/>
+      <w:r>
+        <w:t xml:space="preserve"> en reservas.xlsx.</w:t>
+      </w:r>
+    </w:p>
+    <w:p>
+      <w:pPr>
+        <w:numPr>
+          <w:ilvl w:val="0"/>
+          <w:numId w:val="40"/>
+        </w:numPr>
+      </w:pPr>
+      <w:r>
+        <w:t>Normalización de DNI/NIE en carga: mayúsculas, sin espacios/guiones.</w:t>
+      </w:r>
+    </w:p>
+    <w:p>
+      <w:pPr>
+        <w:rPr>
+          <w:b/>
+          <w:bCs/>
+        </w:rPr>
+      </w:pPr>
+      <w:r>
+        <w:rPr>
+          <w:b/>
+          <w:bCs/>
+        </w:rPr>
+        <w:lastRenderedPageBreak/>
+        <w:t>Cancelar y modificar solo si eres el propietario (ID + email o DNI/NIE)</w:t>
+      </w:r>
+    </w:p>
+    <w:p>
+      <w:r>
+        <w:t>Se endurecieron los flujos transaccionales:</w:t>
+      </w:r>
+    </w:p>
+    <w:p>
+      <w:pPr>
+        <w:numPr>
+          <w:ilvl w:val="0"/>
+          <w:numId w:val="41"/>
+        </w:numPr>
+      </w:pPr>
+      <w:r>
+        <w:rPr>
+          <w:b/>
+          <w:bCs/>
+        </w:rPr>
+        <w:t>Para cancelar/modificar por ID</w:t>
+      </w:r>
+      <w:r>
+        <w:t xml:space="preserve">, el </w:t>
+      </w:r>
+      <w:proofErr w:type="spellStart"/>
+      <w:r>
+        <w:t>bot</w:t>
+      </w:r>
+      <w:proofErr w:type="spellEnd"/>
+      <w:r>
+        <w:t xml:space="preserve"> obliga primero a </w:t>
+      </w:r>
+      <w:r>
+        <w:rPr>
+          <w:b/>
+          <w:bCs/>
+        </w:rPr>
+        <w:t>verificar propiedad</w:t>
+      </w:r>
+      <w:r>
+        <w:t xml:space="preserve"> con </w:t>
+      </w:r>
+      <w:r>
+        <w:rPr>
+          <w:b/>
+          <w:bCs/>
+        </w:rPr>
+        <w:t>email o DNI/NIE</w:t>
+      </w:r>
+      <w:r>
+        <w:t xml:space="preserve"> (uno vale).</w:t>
+      </w:r>
+    </w:p>
+    <w:p>
+      <w:pPr>
+        <w:numPr>
+          <w:ilvl w:val="0"/>
+          <w:numId w:val="41"/>
+        </w:numPr>
+      </w:pPr>
+      <w:r>
+        <w:t>Solo si la verificación coincide con los datos guardados en la reserva (</w:t>
+      </w:r>
+      <w:proofErr w:type="spellStart"/>
+      <w:r>
+        <w:t>cliente_email</w:t>
+      </w:r>
+      <w:proofErr w:type="spellEnd"/>
+      <w:r>
+        <w:t xml:space="preserve"> o </w:t>
+      </w:r>
+      <w:proofErr w:type="spellStart"/>
+      <w:r>
+        <w:t>cliente_dni</w:t>
+      </w:r>
+      <w:proofErr w:type="spellEnd"/>
+      <w:r>
+        <w:t xml:space="preserve">) se pasa a la </w:t>
+      </w:r>
+      <w:r>
+        <w:rPr>
+          <w:b/>
+          <w:bCs/>
+        </w:rPr>
+        <w:t>confirmación final</w:t>
+      </w:r>
+      <w:r>
+        <w:t xml:space="preserve"> (“sí/no”).</w:t>
+      </w:r>
+    </w:p>
+    <w:p>
+      <w:pPr>
+        <w:numPr>
+          <w:ilvl w:val="0"/>
+          <w:numId w:val="41"/>
+        </w:numPr>
+      </w:pPr>
+      <w:r>
+        <w:t>Esto evita que cualquiera que sepa un ID pueda cancelar/modificar reservas ajenas.</w:t>
+      </w:r>
+    </w:p>
+    <w:p>
+      <w:r>
+        <w:rPr>
+          <w:b/>
+          <w:bCs/>
+        </w:rPr>
+        <w:t>Implementación:</w:t>
+      </w:r>
+    </w:p>
+    <w:p>
+      <w:pPr>
+        <w:numPr>
+          <w:ilvl w:val="0"/>
+          <w:numId w:val="42"/>
+        </w:numPr>
+      </w:pPr>
+      <w:r>
+        <w:t xml:space="preserve">Se añadió un </w:t>
+      </w:r>
+      <w:proofErr w:type="spellStart"/>
+      <w:r>
+        <w:t>mini-subflujo</w:t>
+      </w:r>
+      <w:proofErr w:type="spellEnd"/>
+      <w:r>
+        <w:t xml:space="preserve"> </w:t>
+      </w:r>
+      <w:proofErr w:type="spellStart"/>
+      <w:r>
+        <w:t>awaiting_auth</w:t>
+      </w:r>
+      <w:proofErr w:type="spellEnd"/>
+      <w:r>
+        <w:t xml:space="preserve"> en sesión:</w:t>
+      </w:r>
+    </w:p>
+    <w:p>
+      <w:pPr>
+        <w:numPr>
+          <w:ilvl w:val="1"/>
+          <w:numId w:val="42"/>
+        </w:numPr>
+      </w:pPr>
+      <w:proofErr w:type="spellStart"/>
+      <w:r>
+        <w:t>start_cancel_flow</w:t>
+      </w:r>
+      <w:proofErr w:type="spellEnd"/>
+      <w:r>
+        <w:t xml:space="preserve">(...) / </w:t>
+      </w:r>
+      <w:proofErr w:type="spellStart"/>
+      <w:r>
+        <w:t>start_modificar_flow</w:t>
+      </w:r>
+      <w:proofErr w:type="spellEnd"/>
+      <w:r>
+        <w:t xml:space="preserve">(...) guardan </w:t>
+      </w:r>
+      <w:proofErr w:type="spellStart"/>
+      <w:r>
+        <w:t>pending</w:t>
+      </w:r>
+      <w:proofErr w:type="spellEnd"/>
+      <w:r>
+        <w:t>_* y piden credenciales si no vienen.</w:t>
+      </w:r>
+    </w:p>
+    <w:p>
+      <w:pPr>
+        <w:numPr>
+          <w:ilvl w:val="1"/>
+          <w:numId w:val="42"/>
+        </w:numPr>
+      </w:pPr>
+      <w:proofErr w:type="spellStart"/>
+      <w:r>
+        <w:t>handle_cancel_with_session</w:t>
+      </w:r>
+      <w:proofErr w:type="spellEnd"/>
+      <w:r>
+        <w:t xml:space="preserve">(...) / </w:t>
+      </w:r>
+      <w:proofErr w:type="spellStart"/>
+      <w:r>
+        <w:t>handle_modificar_with_session</w:t>
+      </w:r>
+      <w:proofErr w:type="spellEnd"/>
+      <w:r>
+        <w:t>(...) procesan primero la verificación y después la confirmación.</w:t>
+      </w:r>
+    </w:p>
+    <w:p>
+      <w:pPr>
+        <w:numPr>
+          <w:ilvl w:val="0"/>
+          <w:numId w:val="42"/>
+        </w:numPr>
+      </w:pPr>
+      <w:r>
+        <w:t>Se normalizan inputs (_</w:t>
+      </w:r>
+      <w:proofErr w:type="spellStart"/>
+      <w:r>
+        <w:t>norm_email</w:t>
+      </w:r>
+      <w:proofErr w:type="spellEnd"/>
+      <w:r>
+        <w:t>, _</w:t>
+      </w:r>
+      <w:proofErr w:type="spellStart"/>
+      <w:r>
+        <w:t>norm_dni</w:t>
+      </w:r>
+      <w:proofErr w:type="spellEnd"/>
+      <w:r>
+        <w:t>) para evitar fallos por mayúsculas o espacios.</w:t>
+      </w:r>
+    </w:p>
+    <w:p>
+      <w:pPr>
+        <w:numPr>
+          <w:ilvl w:val="0"/>
+          <w:numId w:val="42"/>
+        </w:numPr>
+      </w:pPr>
+      <w:r>
+        <w:t xml:space="preserve">Regla de autorización: </w:t>
+      </w:r>
+      <w:r>
+        <w:rPr>
+          <w:b/>
+          <w:bCs/>
+        </w:rPr>
+        <w:t xml:space="preserve">coincide email OR coincide </w:t>
+      </w:r>
+      <w:proofErr w:type="spellStart"/>
+      <w:r>
+        <w:rPr>
+          <w:b/>
+          <w:bCs/>
+        </w:rPr>
+        <w:t>dni</w:t>
+      </w:r>
+      <w:proofErr w:type="spellEnd"/>
+      <w:r>
+        <w:t>.</w:t>
+      </w:r>
+    </w:p>
+    <w:p>
+      <w:pPr>
+        <w:rPr>
+          <w:b/>
+          <w:bCs/>
+        </w:rPr>
+      </w:pPr>
+      <w:r>
+        <w:rPr>
+          <w:b/>
+          <w:bCs/>
+        </w:rPr>
+        <w:t>Capa de privacidad: no exponer datos personales en respuestas</w:t>
+      </w:r>
+    </w:p>
+    <w:p>
+      <w:r>
+        <w:t xml:space="preserve">Se añadió una capa explícita de privacidad para que al mostrar una reserva (consulta, cancelar, modificar) </w:t>
+      </w:r>
+      <w:r>
+        <w:rPr>
+          <w:b/>
+          <w:bCs/>
+        </w:rPr>
+        <w:t>no se impriman datos personales completos</w:t>
+      </w:r>
+      <w:r>
+        <w:t>.</w:t>
+      </w:r>
+    </w:p>
+    <w:p>
+      <w:r>
+        <w:rPr>
+          <w:b/>
+          <w:bCs/>
+        </w:rPr>
+        <w:t>Componentes:</w:t>
+      </w:r>
+    </w:p>
+    <w:p>
+      <w:pPr>
+        <w:numPr>
+          <w:ilvl w:val="0"/>
+          <w:numId w:val="43"/>
+        </w:numPr>
+      </w:pPr>
+      <w:r>
+        <w:t>privacy.py con utilidades:</w:t>
+      </w:r>
+    </w:p>
+    <w:p>
+      <w:pPr>
+        <w:numPr>
+          <w:ilvl w:val="1"/>
+          <w:numId w:val="43"/>
+        </w:numPr>
+      </w:pPr>
+      <w:proofErr w:type="spellStart"/>
+      <w:r>
+        <w:t>mask_email</w:t>
+      </w:r>
+      <w:proofErr w:type="spellEnd"/>
+      <w:r>
+        <w:t>(...) (ej. la***@dominio.com)</w:t>
+      </w:r>
+    </w:p>
+    <w:p>
+      <w:pPr>
+        <w:numPr>
+          <w:ilvl w:val="1"/>
+          <w:numId w:val="43"/>
+        </w:numPr>
+      </w:pPr>
+      <w:proofErr w:type="spellStart"/>
+      <w:r>
+        <w:t>mask_phone</w:t>
+      </w:r>
+      <w:proofErr w:type="spellEnd"/>
+      <w:r>
+        <w:t>(...) (ej. ***123)</w:t>
+      </w:r>
+    </w:p>
+    <w:p>
+      <w:pPr>
+        <w:numPr>
+          <w:ilvl w:val="1"/>
+          <w:numId w:val="43"/>
+        </w:numPr>
+      </w:pPr>
+      <w:proofErr w:type="spellStart"/>
+      <w:r>
+        <w:t>mask_dni</w:t>
+      </w:r>
+      <w:proofErr w:type="spellEnd"/>
+      <w:r>
+        <w:t>(...) (ej. 12****7Z)</w:t>
+      </w:r>
+    </w:p>
+    <w:p>
+      <w:pPr>
+        <w:numPr>
+          <w:ilvl w:val="0"/>
+          <w:numId w:val="43"/>
+        </w:numPr>
+      </w:pPr>
+      <w:proofErr w:type="spellStart"/>
+      <w:r>
+        <w:t>format_reserva_row</w:t>
+      </w:r>
+      <w:proofErr w:type="spellEnd"/>
+      <w:r>
+        <w:t xml:space="preserve">(...) se modificó para </w:t>
+      </w:r>
+      <w:r>
+        <w:rPr>
+          <w:b/>
+          <w:bCs/>
+        </w:rPr>
+        <w:t>mostrar datos enmascarados</w:t>
+      </w:r>
+      <w:r>
+        <w:t xml:space="preserve"> o incluso solo indicar que existen, pero sin filtrarlos completos.</w:t>
+      </w:r>
+    </w:p>
+    <w:p>
+      <w:r>
+        <w:rPr>
+          <w:b/>
+          <w:bCs/>
+        </w:rPr>
+        <w:t>Error real detectado y corrección:</w:t>
+      </w:r>
+    </w:p>
+    <w:p>
+      <w:pPr>
+        <w:numPr>
+          <w:ilvl w:val="0"/>
+          <w:numId w:val="44"/>
+        </w:numPr>
+      </w:pPr>
+      <w:r>
+        <w:t xml:space="preserve">Al enmascarar teléfono salió: </w:t>
+      </w:r>
+      <w:proofErr w:type="spellStart"/>
+      <w:r>
+        <w:t>TypeError</w:t>
+      </w:r>
+      <w:proofErr w:type="spellEnd"/>
+      <w:r>
+        <w:t xml:space="preserve">: </w:t>
+      </w:r>
+      <w:proofErr w:type="spellStart"/>
+      <w:r>
+        <w:t>expected</w:t>
+      </w:r>
+      <w:proofErr w:type="spellEnd"/>
+      <w:r>
+        <w:t xml:space="preserve"> </w:t>
+      </w:r>
+      <w:proofErr w:type="spellStart"/>
+      <w:r>
+        <w:t>string</w:t>
+      </w:r>
+      <w:proofErr w:type="spellEnd"/>
+      <w:r>
+        <w:t xml:space="preserve"> </w:t>
+      </w:r>
+      <w:proofErr w:type="spellStart"/>
+      <w:r>
+        <w:t>or</w:t>
+      </w:r>
+      <w:proofErr w:type="spellEnd"/>
+      <w:r>
+        <w:t xml:space="preserve"> bytes-</w:t>
+      </w:r>
+      <w:proofErr w:type="spellStart"/>
+      <w:r>
+        <w:t>like</w:t>
+      </w:r>
+      <w:proofErr w:type="spellEnd"/>
+      <w:r>
+        <w:t xml:space="preserve"> </w:t>
+      </w:r>
+      <w:proofErr w:type="spellStart"/>
+      <w:r>
+        <w:t>object</w:t>
+      </w:r>
+      <w:proofErr w:type="spellEnd"/>
+      <w:r>
+        <w:t xml:space="preserve">, </w:t>
+      </w:r>
+      <w:proofErr w:type="spellStart"/>
+      <w:r>
+        <w:t>got</w:t>
+      </w:r>
+      <w:proofErr w:type="spellEnd"/>
+      <w:r>
+        <w:t xml:space="preserve"> '</w:t>
+      </w:r>
+      <w:proofErr w:type="spellStart"/>
+      <w:r>
+        <w:t>float</w:t>
+      </w:r>
+      <w:proofErr w:type="spellEnd"/>
+      <w:r>
+        <w:t>'</w:t>
+      </w:r>
+      <w:r>
+        <w:br/>
+        <w:t xml:space="preserve">Causa: en Excel, teléfonos vacíos o numéricos podían llegar como </w:t>
+      </w:r>
+      <w:proofErr w:type="spellStart"/>
+      <w:r>
+        <w:t>float</w:t>
+      </w:r>
+      <w:proofErr w:type="spellEnd"/>
+      <w:r>
+        <w:t>/NaN.</w:t>
+      </w:r>
+      <w:r>
+        <w:br/>
+        <w:t xml:space="preserve">Fix: hacer funciones de máscara </w:t>
+      </w:r>
+      <w:r>
+        <w:rPr>
+          <w:b/>
+          <w:bCs/>
+        </w:rPr>
+        <w:t>robustas</w:t>
+      </w:r>
+      <w:r>
+        <w:t xml:space="preserve">, casteando a </w:t>
+      </w:r>
+      <w:proofErr w:type="spellStart"/>
+      <w:r>
+        <w:t>string</w:t>
+      </w:r>
+      <w:proofErr w:type="spellEnd"/>
+      <w:r>
+        <w:t xml:space="preserve"> solo cuando procede y controlando NaN (</w:t>
+      </w:r>
+      <w:proofErr w:type="spellStart"/>
+      <w:r>
+        <w:t>pd.isna</w:t>
+      </w:r>
+      <w:proofErr w:type="spellEnd"/>
+      <w:r>
+        <w:t xml:space="preserve">) antes de aplicar </w:t>
+      </w:r>
+      <w:proofErr w:type="spellStart"/>
+      <w:r>
+        <w:t>regex</w:t>
+      </w:r>
+      <w:proofErr w:type="spellEnd"/>
+      <w:r>
+        <w:t>.</w:t>
+      </w:r>
+    </w:p>
+    <w:p>
+      <w:pPr>
+        <w:rPr>
+          <w:b/>
+          <w:bCs/>
+        </w:rPr>
+      </w:pPr>
+      <w:r>
+        <w:rPr>
+          <w:b/>
+          <w:bCs/>
+        </w:rPr>
+        <w:t>“Ya funciona pero no sale el alojamiento” (bug de formato de reserva)</w:t>
+      </w:r>
+    </w:p>
+    <w:p>
+      <w:r>
+        <w:t>Al consultar/cancelar/modificar, el resumen salía sin nombre de alojamiento.</w:t>
+      </w:r>
+    </w:p>
+    <w:p>
+      <w:r>
+        <w:rPr>
+          <w:b/>
+          <w:bCs/>
+        </w:rPr>
+        <w:lastRenderedPageBreak/>
+        <w:t>Causa:</w:t>
+      </w:r>
+    </w:p>
+    <w:p>
+      <w:pPr>
+        <w:numPr>
+          <w:ilvl w:val="0"/>
+          <w:numId w:val="45"/>
+        </w:numPr>
+      </w:pPr>
+      <w:proofErr w:type="spellStart"/>
+      <w:r>
+        <w:t>format_reserva_row</w:t>
+      </w:r>
+      <w:proofErr w:type="spellEnd"/>
+      <w:r>
+        <w:t xml:space="preserve">(...) intentaba leer alojamiento / </w:t>
+      </w:r>
+      <w:proofErr w:type="spellStart"/>
+      <w:r>
+        <w:t>nombre_alojamiento</w:t>
+      </w:r>
+      <w:proofErr w:type="spellEnd"/>
+      <w:r>
+        <w:t xml:space="preserve">, pero en reservas.xlsx realmente está </w:t>
+      </w:r>
+      <w:proofErr w:type="spellStart"/>
+      <w:r>
+        <w:t>id_alojamiento</w:t>
+      </w:r>
+      <w:proofErr w:type="spellEnd"/>
+      <w:r>
+        <w:t>.</w:t>
+      </w:r>
+    </w:p>
+    <w:p>
+      <w:r>
+        <w:rPr>
+          <w:b/>
+          <w:bCs/>
+        </w:rPr>
+        <w:t>Corrección:</w:t>
+      </w:r>
+    </w:p>
+    <w:p>
+      <w:pPr>
+        <w:numPr>
+          <w:ilvl w:val="0"/>
+          <w:numId w:val="46"/>
+        </w:numPr>
+      </w:pPr>
+      <w:r>
+        <w:t xml:space="preserve">En </w:t>
+      </w:r>
+      <w:proofErr w:type="spellStart"/>
+      <w:r>
+        <w:t>format_reserva_row</w:t>
+      </w:r>
+      <w:proofErr w:type="spellEnd"/>
+      <w:r>
+        <w:t xml:space="preserve">(...) se añadió </w:t>
+      </w:r>
+      <w:proofErr w:type="spellStart"/>
+      <w:r>
+        <w:t>fallback</w:t>
+      </w:r>
+      <w:proofErr w:type="spellEnd"/>
+      <w:r>
+        <w:t>:</w:t>
+      </w:r>
+    </w:p>
+    <w:p>
+      <w:pPr>
+        <w:numPr>
+          <w:ilvl w:val="1"/>
+          <w:numId w:val="46"/>
+        </w:numPr>
+      </w:pPr>
+      <w:r>
+        <w:t xml:space="preserve">si no hay nombre, usar </w:t>
+      </w:r>
+      <w:proofErr w:type="spellStart"/>
+      <w:r>
+        <w:t>id_alojamiento</w:t>
+      </w:r>
+      <w:proofErr w:type="spellEnd"/>
+      <w:r>
+        <w:t xml:space="preserve"> → </w:t>
+      </w:r>
+      <w:proofErr w:type="spellStart"/>
+      <w:r>
+        <w:t>nombre_de</w:t>
+      </w:r>
+      <w:proofErr w:type="spellEnd"/>
+      <w:r>
+        <w:t>(</w:t>
+      </w:r>
+      <w:proofErr w:type="spellStart"/>
+      <w:r>
+        <w:t>id_alojamiento</w:t>
+      </w:r>
+      <w:proofErr w:type="spellEnd"/>
+      <w:r>
+        <w:t>).</w:t>
+      </w:r>
+    </w:p>
+    <w:p>
+      <w:pPr>
+        <w:numPr>
+          <w:ilvl w:val="0"/>
+          <w:numId w:val="46"/>
+        </w:numPr>
+      </w:pPr>
+      <w:r>
+        <w:t>Se añadió _</w:t>
+      </w:r>
+      <w:proofErr w:type="spellStart"/>
+      <w:r>
+        <w:t>safe_int</w:t>
+      </w:r>
+      <w:proofErr w:type="spellEnd"/>
+      <w:r>
+        <w:t xml:space="preserve">(...) para convertir </w:t>
+      </w:r>
+      <w:proofErr w:type="spellStart"/>
+      <w:r>
+        <w:t>id_alojamiento</w:t>
+      </w:r>
+      <w:proofErr w:type="spellEnd"/>
+      <w:r>
+        <w:t xml:space="preserve"> aunque venga como </w:t>
+      </w:r>
+      <w:proofErr w:type="spellStart"/>
+      <w:r>
+        <w:t>string</w:t>
+      </w:r>
+      <w:proofErr w:type="spellEnd"/>
+      <w:r>
+        <w:t>/</w:t>
+      </w:r>
+      <w:proofErr w:type="spellStart"/>
+      <w:r>
+        <w:t>float</w:t>
+      </w:r>
+      <w:proofErr w:type="spellEnd"/>
+      <w:r>
+        <w:t>.</w:t>
+      </w:r>
+    </w:p>
+    <w:p>
+      <w:pPr>
+        <w:rPr>
+          <w:b/>
+          <w:bCs/>
+        </w:rPr>
+      </w:pPr>
+      <w:r>
+        <w:rPr>
+          <w:b/>
+          <w:bCs/>
+        </w:rPr>
+        <w:t>Error de escritura en reservas.xlsx (</w:t>
+      </w:r>
+      <w:proofErr w:type="spellStart"/>
+      <w:r>
+        <w:rPr>
+          <w:b/>
+          <w:bCs/>
+        </w:rPr>
+        <w:t>PermissionError</w:t>
+      </w:r>
+      <w:proofErr w:type="spellEnd"/>
+      <w:r>
+        <w:rPr>
+          <w:b/>
+          <w:bCs/>
+        </w:rPr>
+        <w:t>)</w:t>
+      </w:r>
+    </w:p>
+    <w:p>
+      <w:r>
+        <w:t>Durante pruebas de creación de reserva apareció:</w:t>
+      </w:r>
+      <w:r>
+        <w:br/>
+      </w:r>
+      <w:proofErr w:type="spellStart"/>
+      <w:r>
+        <w:t>PermissionError</w:t>
+      </w:r>
+      <w:proofErr w:type="spellEnd"/>
+      <w:r>
+        <w:t>: [</w:t>
+      </w:r>
+      <w:proofErr w:type="spellStart"/>
+      <w:r>
+        <w:t>Errno</w:t>
+      </w:r>
+      <w:proofErr w:type="spellEnd"/>
+      <w:r>
+        <w:t xml:space="preserve"> 13] </w:t>
+      </w:r>
+      <w:proofErr w:type="spellStart"/>
+      <w:r>
+        <w:t>Permission</w:t>
+      </w:r>
+      <w:proofErr w:type="spellEnd"/>
+      <w:r>
+        <w:t xml:space="preserve"> </w:t>
+      </w:r>
+      <w:proofErr w:type="spellStart"/>
+      <w:r>
+        <w:t>denied</w:t>
+      </w:r>
+      <w:proofErr w:type="spellEnd"/>
+      <w:r>
+        <w:t>: '...reservas.xlsx'</w:t>
+      </w:r>
+    </w:p>
+    <w:p>
+      <w:r>
+        <w:rPr>
+          <w:b/>
+          <w:bCs/>
+        </w:rPr>
+        <w:t>Causa típica en Windows:</w:t>
+      </w:r>
+    </w:p>
+    <w:p>
+      <w:pPr>
+        <w:numPr>
+          <w:ilvl w:val="0"/>
+          <w:numId w:val="47"/>
+        </w:numPr>
+      </w:pPr>
+      <w:r>
+        <w:t xml:space="preserve">El archivo reservas.xlsx estaba abierto en Excel (bloqueo de escritura) o el sistema tenía </w:t>
+      </w:r>
+      <w:proofErr w:type="spellStart"/>
+      <w:r>
+        <w:t>lock</w:t>
+      </w:r>
+      <w:proofErr w:type="spellEnd"/>
+      <w:r>
+        <w:t>.</w:t>
+      </w:r>
+    </w:p>
+    <w:p>
+      <w:r>
+        <w:rPr>
+          <w:b/>
+          <w:bCs/>
+        </w:rPr>
+        <w:t>Medida práctica:</w:t>
+      </w:r>
+    </w:p>
+    <w:p>
+      <w:pPr>
+        <w:numPr>
+          <w:ilvl w:val="0"/>
+          <w:numId w:val="48"/>
+        </w:numPr>
+      </w:pPr>
+      <w:r>
+        <w:t>Cerrar Excel antes de reservar/cancelar/modificar.</w:t>
+      </w:r>
+    </w:p>
+    <w:p>
+      <w:pPr>
+        <w:numPr>
+          <w:ilvl w:val="0"/>
+          <w:numId w:val="48"/>
+        </w:numPr>
+      </w:pPr>
+      <w:r>
+        <w:t xml:space="preserve">En desarrollo, se recomienda que el </w:t>
+      </w:r>
+      <w:proofErr w:type="spellStart"/>
+      <w:r>
+        <w:t>bot</w:t>
+      </w:r>
+      <w:proofErr w:type="spellEnd"/>
+      <w:r>
+        <w:t xml:space="preserve"> devuelva un mensaje más claro si el guardado falla (pendiente si se quiere pulir): “Cierra el Excel y reintenta”.</w:t>
+      </w:r>
+    </w:p>
+    <w:p>
+      <w:pPr>
+        <w:rPr>
+          <w:b/>
+          <w:bCs/>
+        </w:rPr>
+      </w:pPr>
+      <w:r>
+        <w:rPr>
+          <w:b/>
+          <w:bCs/>
+        </w:rPr>
+        <w:t>Inferencia de año cuando el usuario escribe fechas sin año</w:t>
+      </w:r>
+    </w:p>
+    <w:p>
+      <w:r>
+        <w:t>Se abordó la mejora pedida por tutor: cuando el usuario escribe “09/02” el sistema no debe asumir 2025/2026 de forma incorrecta.</w:t>
+      </w:r>
+    </w:p>
+    <w:p>
+      <w:r>
+        <w:rPr>
+          <w:b/>
+          <w:bCs/>
+        </w:rPr>
+        <w:t>Regla aplicada:</w:t>
+      </w:r>
+    </w:p>
+    <w:p>
+      <w:pPr>
+        <w:numPr>
+          <w:ilvl w:val="0"/>
+          <w:numId w:val="49"/>
+        </w:numPr>
+      </w:pPr>
+      <w:r>
+        <w:t xml:space="preserve">Si falta el año, se infiere el </w:t>
+      </w:r>
+      <w:r>
+        <w:rPr>
+          <w:b/>
+          <w:bCs/>
+        </w:rPr>
+        <w:t>año más razonable</w:t>
+      </w:r>
+      <w:r>
+        <w:t>:</w:t>
+      </w:r>
+    </w:p>
+    <w:p>
+      <w:pPr>
+        <w:numPr>
+          <w:ilvl w:val="1"/>
+          <w:numId w:val="49"/>
+        </w:numPr>
+      </w:pPr>
+      <w:r>
+        <w:t>por defecto el año actual,</w:t>
+      </w:r>
+    </w:p>
+    <w:p>
+      <w:pPr>
+        <w:numPr>
+          <w:ilvl w:val="1"/>
+          <w:numId w:val="49"/>
+        </w:numPr>
+      </w:pPr>
+      <w:r>
+        <w:t xml:space="preserve">pero si la fecha </w:t>
+      </w:r>
+      <w:proofErr w:type="spellStart"/>
+      <w:r>
+        <w:t>dd</w:t>
+      </w:r>
+      <w:proofErr w:type="spellEnd"/>
+      <w:r>
+        <w:t xml:space="preserve">/mm ya pasó en el año actual respecto a “hoy”, se interpreta como </w:t>
+      </w:r>
+      <w:r>
+        <w:rPr>
+          <w:b/>
+          <w:bCs/>
+        </w:rPr>
+        <w:t>año siguiente</w:t>
+      </w:r>
+      <w:r>
+        <w:t>.</w:t>
+      </w:r>
+      <w:r>
+        <w:br/>
+        <w:t xml:space="preserve">Esto evita que en enero el </w:t>
+      </w:r>
+      <w:proofErr w:type="spellStart"/>
+      <w:r>
+        <w:t>bot</w:t>
+      </w:r>
+      <w:proofErr w:type="spellEnd"/>
+      <w:r>
+        <w:t xml:space="preserve"> lea “09/02” como año pasado o que falle en rangos futuros.</w:t>
+      </w:r>
+    </w:p>
+    <w:p>
+      <w:r>
+        <w:pict w14:anchorId="2E45653D">
+          <v:rect id="_x0000_i1037" style="width:0;height:1.5pt" o:hralign="center" o:hrstd="t" o:hr="t" fillcolor="#a0a0a0" stroked="f"/>
+        </w:pict>
+      </w:r>
+    </w:p>
+    <w:p>
+      <w:pPr>
+        <w:rPr>
+          <w:b/>
+          <w:bCs/>
+        </w:rPr>
+      </w:pPr>
+      <w:r>
+        <w:rPr>
+          <w:b/>
+          <w:bCs/>
+        </w:rPr>
+        <w:t>Fase 2</w:t>
+      </w:r>
+      <w:r>
+        <w:rPr>
+          <w:b/>
+          <w:bCs/>
+        </w:rPr>
+        <w:t xml:space="preserve">: </w:t>
+      </w:r>
+      <w:proofErr w:type="spellStart"/>
+      <w:r>
+        <w:rPr>
+          <w:b/>
+          <w:bCs/>
+        </w:rPr>
+        <w:t>Meteo</w:t>
+      </w:r>
+      <w:proofErr w:type="spellEnd"/>
+      <w:r>
+        <w:rPr>
+          <w:b/>
+          <w:bCs/>
+        </w:rPr>
+        <w:t xml:space="preserve"> real + </w:t>
+      </w:r>
+      <w:proofErr w:type="spellStart"/>
+      <w:r>
+        <w:rPr>
+          <w:b/>
+          <w:bCs/>
+        </w:rPr>
+        <w:t>pricing</w:t>
+      </w:r>
+      <w:proofErr w:type="spellEnd"/>
+      <w:r>
+        <w:rPr>
+          <w:b/>
+          <w:bCs/>
+        </w:rPr>
+        <w:t xml:space="preserve"> dinámico</w:t>
+      </w:r>
+    </w:p>
+    <w:p>
+      <w:pPr>
+        <w:rPr>
+          <w:b/>
+          <w:bCs/>
+        </w:rPr>
+      </w:pPr>
+      <w:proofErr w:type="spellStart"/>
+      <w:r>
+        <w:rPr>
+          <w:b/>
+          <w:bCs/>
+        </w:rPr>
+        <w:t>Meteo</w:t>
+      </w:r>
+      <w:proofErr w:type="spellEnd"/>
+      <w:r>
+        <w:rPr>
+          <w:b/>
+          <w:bCs/>
+        </w:rPr>
+        <w:t xml:space="preserve"> real con Open-</w:t>
+      </w:r>
+      <w:proofErr w:type="spellStart"/>
+      <w:r>
+        <w:rPr>
+          <w:b/>
+          <w:bCs/>
+        </w:rPr>
+        <w:t>Meteo</w:t>
+      </w:r>
+      <w:proofErr w:type="spellEnd"/>
+      <w:r>
+        <w:rPr>
+          <w:b/>
+          <w:bCs/>
+        </w:rPr>
+        <w:t xml:space="preserve"> (weather_client.py) y </w:t>
+      </w:r>
+      <w:proofErr w:type="spellStart"/>
+      <w:r>
+        <w:rPr>
+          <w:b/>
+          <w:bCs/>
+        </w:rPr>
+        <w:t>meteo-bot</w:t>
+      </w:r>
+      <w:proofErr w:type="spellEnd"/>
+      <w:r>
+        <w:rPr>
+          <w:b/>
+          <w:bCs/>
+        </w:rPr>
+        <w:t xml:space="preserve"> con memoria de sesión</w:t>
+      </w:r>
+    </w:p>
+    <w:p>
+      <w:r>
+        <w:t>Se sustituyó la parte “</w:t>
+      </w:r>
+      <w:proofErr w:type="spellStart"/>
+      <w:r>
+        <w:t>mock</w:t>
+      </w:r>
+      <w:proofErr w:type="spellEnd"/>
+      <w:r>
+        <w:t xml:space="preserve">” del </w:t>
+      </w:r>
+      <w:proofErr w:type="spellStart"/>
+      <w:r>
+        <w:t>meteo</w:t>
+      </w:r>
+      <w:proofErr w:type="spellEnd"/>
+      <w:r>
+        <w:t xml:space="preserve"> por un cliente real a </w:t>
+      </w:r>
+      <w:r>
+        <w:rPr>
+          <w:b/>
+          <w:bCs/>
+        </w:rPr>
+        <w:t>Open-</w:t>
+      </w:r>
+      <w:proofErr w:type="spellStart"/>
+      <w:r>
+        <w:rPr>
+          <w:b/>
+          <w:bCs/>
+        </w:rPr>
+        <w:t>Meteo</w:t>
+      </w:r>
+      <w:proofErr w:type="spellEnd"/>
+      <w:r>
+        <w:t>:</w:t>
+      </w:r>
+    </w:p>
+    <w:p>
+      <w:pPr>
+        <w:numPr>
+          <w:ilvl w:val="0"/>
+          <w:numId w:val="50"/>
+        </w:numPr>
+      </w:pPr>
+      <w:r>
+        <w:t>weather_client.py:</w:t>
+      </w:r>
+    </w:p>
+    <w:p>
+      <w:pPr>
+        <w:numPr>
+          <w:ilvl w:val="1"/>
+          <w:numId w:val="50"/>
+        </w:numPr>
+      </w:pPr>
+      <w:r>
+        <w:t>obtiene coordenadas desde alojamientos.xlsx (</w:t>
+      </w:r>
+      <w:proofErr w:type="spellStart"/>
+      <w:r>
+        <w:t>lat</w:t>
+      </w:r>
+      <w:proofErr w:type="spellEnd"/>
+      <w:r>
+        <w:t>/</w:t>
+      </w:r>
+      <w:proofErr w:type="spellStart"/>
+      <w:r>
+        <w:t>lon</w:t>
+      </w:r>
+      <w:proofErr w:type="spellEnd"/>
+      <w:r>
+        <w:t xml:space="preserve">) con </w:t>
+      </w:r>
+      <w:proofErr w:type="spellStart"/>
+      <w:r>
+        <w:t>fallback</w:t>
+      </w:r>
+      <w:proofErr w:type="spellEnd"/>
+      <w:r>
+        <w:t xml:space="preserve"> a </w:t>
+      </w:r>
+      <w:proofErr w:type="spellStart"/>
+      <w:r>
+        <w:t>Cobisa</w:t>
+      </w:r>
+      <w:proofErr w:type="spellEnd"/>
+      <w:r>
+        <w:t>.</w:t>
+      </w:r>
+    </w:p>
+    <w:p>
+      <w:pPr>
+        <w:numPr>
+          <w:ilvl w:val="1"/>
+          <w:numId w:val="50"/>
+        </w:numPr>
+      </w:pPr>
+      <w:r>
+        <w:lastRenderedPageBreak/>
+        <w:t xml:space="preserve">llama al </w:t>
+      </w:r>
+      <w:proofErr w:type="spellStart"/>
+      <w:r>
+        <w:t>endpoint</w:t>
+      </w:r>
+      <w:proofErr w:type="spellEnd"/>
+      <w:r>
+        <w:t xml:space="preserve"> de </w:t>
+      </w:r>
+      <w:proofErr w:type="spellStart"/>
+      <w:r>
+        <w:t>forecast</w:t>
+      </w:r>
+      <w:proofErr w:type="spellEnd"/>
+      <w:r>
+        <w:t xml:space="preserve"> diario.</w:t>
+      </w:r>
+    </w:p>
+    <w:p>
+      <w:pPr>
+        <w:numPr>
+          <w:ilvl w:val="1"/>
+          <w:numId w:val="50"/>
+        </w:numPr>
+      </w:pPr>
+      <w:r>
+        <w:t xml:space="preserve">resume </w:t>
+      </w:r>
+      <w:proofErr w:type="spellStart"/>
+      <w:r>
+        <w:t>Tª</w:t>
+      </w:r>
+      <w:proofErr w:type="spellEnd"/>
+      <w:r>
+        <w:t xml:space="preserve"> </w:t>
+      </w:r>
+      <w:proofErr w:type="spellStart"/>
+      <w:r>
+        <w:t>max</w:t>
+      </w:r>
+      <w:proofErr w:type="spellEnd"/>
+      <w:r>
+        <w:t>/min, precipitación y probabilidad de lluvia para el rango.</w:t>
+      </w:r>
+    </w:p>
+    <w:p>
+      <w:pPr>
+        <w:numPr>
+          <w:ilvl w:val="1"/>
+          <w:numId w:val="50"/>
+        </w:numPr>
+      </w:pPr>
+      <w:r>
+        <w:t>aplica reglas de negocio: pasado → no, demasiado lejos → no (horizonte ~16 días), rango mixto → recorta a hoy.</w:t>
+      </w:r>
+    </w:p>
+    <w:p>
+      <w:pPr>
+        <w:numPr>
+          <w:ilvl w:val="0"/>
+          <w:numId w:val="50"/>
+        </w:numPr>
+      </w:pPr>
+      <w:r>
+        <w:t>bots_meteo.py:</w:t>
+      </w:r>
+    </w:p>
+    <w:p>
+      <w:pPr>
+        <w:numPr>
+          <w:ilvl w:val="1"/>
+          <w:numId w:val="50"/>
+        </w:numPr>
+      </w:pPr>
+      <w:r>
+        <w:t>si el usuario no da fechas, intenta usar SESS[</w:t>
+      </w:r>
+      <w:proofErr w:type="spellStart"/>
+      <w:r>
+        <w:t>session_id</w:t>
+      </w:r>
+      <w:proofErr w:type="spellEnd"/>
+      <w:r>
+        <w:t>]["</w:t>
+      </w:r>
+      <w:proofErr w:type="spellStart"/>
+      <w:r>
+        <w:t>last_range</w:t>
+      </w:r>
+      <w:proofErr w:type="spellEnd"/>
+      <w:r>
+        <w:t>"] (última reserva confirmada) y así permite:</w:t>
+      </w:r>
+      <w:r>
+        <w:br/>
+        <w:t>“¿Y qué tiempo hará para esas fechas?” inmediatamente después de reservar.</w:t>
+      </w:r>
+    </w:p>
+    <w:p>
+      <w:r>
+        <w:rPr>
+          <w:b/>
+          <w:bCs/>
+        </w:rPr>
+        <w:t xml:space="preserve">Pendientes dentro de </w:t>
+      </w:r>
+      <w:proofErr w:type="spellStart"/>
+      <w:r>
+        <w:rPr>
+          <w:b/>
+          <w:bCs/>
+        </w:rPr>
+        <w:t>Meteo</w:t>
+      </w:r>
+      <w:proofErr w:type="spellEnd"/>
+      <w:r>
+        <w:rPr>
+          <w:b/>
+          <w:bCs/>
+        </w:rPr>
+        <w:t xml:space="preserve"> (siguiente iteración):</w:t>
+      </w:r>
+    </w:p>
+    <w:p>
+      <w:pPr>
+        <w:numPr>
+          <w:ilvl w:val="0"/>
+          <w:numId w:val="51"/>
+        </w:numPr>
+      </w:pPr>
+      <w:r>
+        <w:t xml:space="preserve">añadir </w:t>
+      </w:r>
+      <w:proofErr w:type="spellStart"/>
+      <w:r>
+        <w:t>windspeed</w:t>
+      </w:r>
+      <w:proofErr w:type="spellEnd"/>
+      <w:r>
+        <w:t xml:space="preserve"> al resumen,</w:t>
+      </w:r>
+    </w:p>
+    <w:p>
+      <w:pPr>
+        <w:numPr>
+          <w:ilvl w:val="0"/>
+          <w:numId w:val="51"/>
+        </w:numPr>
+      </w:pPr>
+      <w:r>
+        <w:t>incluir explícitamente el lugar (“</w:t>
+      </w:r>
+      <w:proofErr w:type="spellStart"/>
+      <w:r>
+        <w:t>Cobisa</w:t>
+      </w:r>
+      <w:proofErr w:type="spellEnd"/>
+      <w:r>
+        <w:t>” o nombre del alojamiento/localidad) en el texto.</w:t>
+      </w:r>
+    </w:p>
+    <w:p>
+      <w:pPr>
+        <w:rPr>
+          <w:b/>
+          <w:bCs/>
+        </w:rPr>
+      </w:pPr>
+      <w:proofErr w:type="spellStart"/>
+      <w:r>
+        <w:rPr>
+          <w:b/>
+          <w:bCs/>
+        </w:rPr>
+        <w:t>Pricing</w:t>
+      </w:r>
+      <w:proofErr w:type="spellEnd"/>
+      <w:r>
+        <w:rPr>
+          <w:b/>
+          <w:bCs/>
+        </w:rPr>
+        <w:t>: reglas de negocio de descuentos dinámicos (estructura preparada)</w:t>
+      </w:r>
+    </w:p>
+    <w:p>
+      <w:r>
+        <w:t xml:space="preserve">Se inició la capa de </w:t>
+      </w:r>
+      <w:proofErr w:type="spellStart"/>
+      <w:r>
+        <w:t>pricing</w:t>
+      </w:r>
+      <w:proofErr w:type="spellEnd"/>
+      <w:r>
+        <w:t xml:space="preserve"> separada del dominio:</w:t>
+      </w:r>
+    </w:p>
+    <w:p>
+      <w:pPr>
+        <w:numPr>
+          <w:ilvl w:val="0"/>
+          <w:numId w:val="52"/>
+        </w:numPr>
+      </w:pPr>
+      <w:r>
+        <w:t>pricing.py (nuevo módulo) con funciones tipo:</w:t>
+      </w:r>
+    </w:p>
+    <w:p>
+      <w:pPr>
+        <w:numPr>
+          <w:ilvl w:val="1"/>
+          <w:numId w:val="52"/>
+        </w:numPr>
+      </w:pPr>
+      <w:proofErr w:type="spellStart"/>
+      <w:r>
+        <w:t>dynamic_discount_pct</w:t>
+      </w:r>
+      <w:proofErr w:type="spellEnd"/>
+      <w:r>
+        <w:t>(</w:t>
+      </w:r>
+      <w:proofErr w:type="spellStart"/>
+      <w:r>
+        <w:t>check_in</w:t>
+      </w:r>
+      <w:proofErr w:type="spellEnd"/>
+      <w:r>
+        <w:t xml:space="preserve">, </w:t>
+      </w:r>
+      <w:proofErr w:type="spellStart"/>
+      <w:r>
+        <w:t>today</w:t>
+      </w:r>
+      <w:proofErr w:type="spellEnd"/>
+      <w:r>
+        <w:t>, ...)</w:t>
+      </w:r>
+    </w:p>
+    <w:p>
+      <w:pPr>
+        <w:numPr>
+          <w:ilvl w:val="1"/>
+          <w:numId w:val="52"/>
+        </w:numPr>
+      </w:pPr>
+      <w:proofErr w:type="spellStart"/>
+      <w:r>
+        <w:t>apply_discount</w:t>
+      </w:r>
+      <w:proofErr w:type="spellEnd"/>
+      <w:r>
+        <w:t>(</w:t>
+      </w:r>
+      <w:proofErr w:type="spellStart"/>
+      <w:r>
+        <w:t>precio_base</w:t>
+      </w:r>
+      <w:proofErr w:type="spellEnd"/>
+      <w:r>
+        <w:t xml:space="preserve">, </w:t>
+      </w:r>
+      <w:proofErr w:type="spellStart"/>
+      <w:r>
+        <w:t>pct</w:t>
+      </w:r>
+      <w:proofErr w:type="spellEnd"/>
+      <w:r>
+        <w:t>)</w:t>
+      </w:r>
+    </w:p>
+    <w:p>
+      <w:pPr>
+        <w:numPr>
+          <w:ilvl w:val="0"/>
+          <w:numId w:val="52"/>
+        </w:numPr>
+      </w:pPr>
+      <w:r>
+        <w:t>Integración prevista/realizada parcialmente en:</w:t>
+      </w:r>
+    </w:p>
+    <w:p>
+      <w:pPr>
+        <w:numPr>
+          <w:ilvl w:val="1"/>
+          <w:numId w:val="52"/>
+        </w:numPr>
+      </w:pPr>
+      <w:r>
+        <w:t xml:space="preserve">domain_reservas.py para calcular </w:t>
+      </w:r>
+      <w:proofErr w:type="spellStart"/>
+      <w:r>
+        <w:t>precio_total</w:t>
+      </w:r>
+      <w:proofErr w:type="spellEnd"/>
+      <w:r>
+        <w:t xml:space="preserve"> teniendo en cuenta descuento,</w:t>
+      </w:r>
+    </w:p>
+    <w:p>
+      <w:pPr>
+        <w:numPr>
+          <w:ilvl w:val="1"/>
+          <w:numId w:val="52"/>
+        </w:numPr>
+      </w:pPr>
+      <w:r>
+        <w:t xml:space="preserve">session_flows.py para que el </w:t>
+      </w:r>
+      <w:r>
+        <w:rPr>
+          <w:b/>
+          <w:bCs/>
+        </w:rPr>
+        <w:t>resumen antes de confirmar</w:t>
+      </w:r>
+      <w:r>
+        <w:t xml:space="preserve"> explique:</w:t>
+      </w:r>
+      <w:r>
+        <w:br/>
+        <w:t>precio base, descuento aplicado y total final.</w:t>
+      </w:r>
+    </w:p>
+    <w:p>
+      <w:r>
+        <w:rPr>
+          <w:b/>
+          <w:bCs/>
+        </w:rPr>
+        <w:t>Objetivo funcional:</w:t>
+      </w:r>
+    </w:p>
+    <w:p>
+      <w:pPr>
+        <w:numPr>
+          <w:ilvl w:val="0"/>
+          <w:numId w:val="53"/>
+        </w:numPr>
+      </w:pPr>
+      <w:r>
+        <w:t xml:space="preserve">cuanto más cercano el </w:t>
+      </w:r>
+      <w:proofErr w:type="spellStart"/>
+      <w:r>
+        <w:t>check</w:t>
+      </w:r>
+      <w:proofErr w:type="spellEnd"/>
+      <w:r>
+        <w:t>-in (especialmente dentro de ~10 días), mayor descuento, para incentivar ocupación de última hora.</w:t>
+      </w:r>
+    </w:p>
+    <w:p>
+      <w:pPr>
+        <w:numPr>
+          <w:ilvl w:val="0"/>
+          <w:numId w:val="53"/>
+        </w:numPr>
+      </w:pPr>
+      <w:r>
+        <w:t xml:space="preserve">el descuento debe verse </w:t>
+      </w:r>
+      <w:r>
+        <w:rPr>
+          <w:b/>
+          <w:bCs/>
+        </w:rPr>
+        <w:t>antes</w:t>
+      </w:r>
+      <w:r>
+        <w:t xml:space="preserve"> de confirmar (transparencia) y persistirse en el total final.</w:t>
+      </w:r>
+    </w:p>
+    <w:p>
+      <w:r>
+        <w:pict w14:anchorId="37499095">
+          <v:rect id="_x0000_i1038" style="width:0;height:1.5pt" o:hralign="center" o:hrstd="t" o:hr="t" fillcolor="#a0a0a0" stroked="f"/>
+        </w:pict>
+      </w:r>
+    </w:p>
+    <w:p>
+      <w:pPr>
+        <w:rPr>
+          <w:b/>
+          <w:bCs/>
+        </w:rPr>
+      </w:pPr>
+      <w:r>
+        <w:rPr>
+          <w:b/>
+          <w:bCs/>
+        </w:rPr>
+        <w:t>UI/</w:t>
+      </w:r>
+      <w:proofErr w:type="spellStart"/>
+      <w:r>
+        <w:rPr>
+          <w:b/>
+          <w:bCs/>
+        </w:rPr>
+        <w:t>Frontend</w:t>
+      </w:r>
+      <w:proofErr w:type="spellEnd"/>
+      <w:r>
+        <w:rPr>
+          <w:b/>
+          <w:bCs/>
+        </w:rPr>
+        <w:t xml:space="preserve">: ajustes de </w:t>
+      </w:r>
+      <w:proofErr w:type="spellStart"/>
+      <w:r>
+        <w:rPr>
+          <w:b/>
+          <w:bCs/>
+        </w:rPr>
+        <w:t>layout</w:t>
+      </w:r>
+      <w:proofErr w:type="spellEnd"/>
+      <w:r>
+        <w:rPr>
+          <w:b/>
+          <w:bCs/>
+        </w:rPr>
+        <w:t xml:space="preserve"> y escalabilidad (incidencias y evolución)</w:t>
+      </w:r>
+    </w:p>
+    <w:p>
+      <w:r>
+        <w:t xml:space="preserve">Durante el rediseño del </w:t>
+      </w:r>
+      <w:proofErr w:type="spellStart"/>
+      <w:r>
+        <w:t>frontend</w:t>
+      </w:r>
+      <w:proofErr w:type="spellEnd"/>
+      <w:r>
+        <w:t xml:space="preserve"> se iteró el CSS para resolver:</w:t>
+      </w:r>
+    </w:p>
+    <w:p>
+      <w:pPr>
+        <w:numPr>
+          <w:ilvl w:val="0"/>
+          <w:numId w:val="54"/>
+        </w:numPr>
+      </w:pPr>
+      <w:r>
+        <w:t>ancho completo desperdiciado (contenedor demasiado estrecho),</w:t>
+      </w:r>
+    </w:p>
+    <w:p>
+      <w:pPr>
+        <w:numPr>
+          <w:ilvl w:val="0"/>
+          <w:numId w:val="54"/>
+        </w:numPr>
+      </w:pPr>
+      <w:r>
+        <w:t xml:space="preserve">luego exceso de “full </w:t>
+      </w:r>
+      <w:proofErr w:type="spellStart"/>
+      <w:r>
+        <w:t>width</w:t>
+      </w:r>
+      <w:proofErr w:type="spellEnd"/>
+      <w:r>
+        <w:t>” sin márgenes,</w:t>
+      </w:r>
+    </w:p>
+    <w:p>
+      <w:pPr>
+        <w:numPr>
+          <w:ilvl w:val="0"/>
+          <w:numId w:val="54"/>
+        </w:numPr>
+      </w:pPr>
+      <w:r>
+        <w:t xml:space="preserve">solución final: </w:t>
+      </w:r>
+      <w:proofErr w:type="spellStart"/>
+      <w:r>
+        <w:t>layout</w:t>
+      </w:r>
+      <w:proofErr w:type="spellEnd"/>
+      <w:r>
+        <w:t xml:space="preserve"> centrado con márgenes laterales consistentes y contenido respirable.</w:t>
+      </w:r>
+    </w:p>
+    <w:p>
+      <w:r>
+        <w:lastRenderedPageBreak/>
+        <w:t>Esto se hizo ajustando .app (</w:t>
+      </w:r>
+      <w:proofErr w:type="spellStart"/>
+      <w:r>
+        <w:t>max-width</w:t>
+      </w:r>
+      <w:proofErr w:type="spellEnd"/>
+      <w:r>
+        <w:t>/márgenes/</w:t>
+      </w:r>
+      <w:proofErr w:type="spellStart"/>
+      <w:r>
+        <w:t>padding</w:t>
+      </w:r>
+      <w:proofErr w:type="spellEnd"/>
+      <w:r>
+        <w:t>) y validándolo visualmente en pantallas grandes.</w:t>
       </w:r>
     </w:p>
     <w:p/>
@@ -6092,6 +7882,304 @@
     </w:lvl>
   </w:abstractNum>
   <w:abstractNum w:abstractNumId="2" w15:restartNumberingAfterBreak="0">
+    <w:nsid w:val="0B8F29F1"/>
+    <w:multiLevelType w:val="multilevel"/>
+    <w:tmpl w:val="9F78591C"/>
+    <w:lvl w:ilvl="0">
+      <w:start w:val="1"/>
+      <w:numFmt w:val="bullet"/>
+      <w:lvlText w:val=""/>
+      <w:lvlJc w:val="left"/>
+      <w:pPr>
+        <w:tabs>
+          <w:tab w:val="num" w:pos="720"/>
+        </w:tabs>
+        <w:ind w:left="720" w:hanging="360"/>
+      </w:pPr>
+      <w:rPr>
+        <w:rFonts w:ascii="Symbol" w:hAnsi="Symbol" w:hint="default"/>
+        <w:sz w:val="20"/>
+      </w:rPr>
+    </w:lvl>
+    <w:lvl w:ilvl="1" w:tentative="1">
+      <w:start w:val="1"/>
+      <w:numFmt w:val="bullet"/>
+      <w:lvlText w:val="o"/>
+      <w:lvlJc w:val="left"/>
+      <w:pPr>
+        <w:tabs>
+          <w:tab w:val="num" w:pos="1440"/>
+        </w:tabs>
+        <w:ind w:left="1440" w:hanging="360"/>
+      </w:pPr>
+      <w:rPr>
+        <w:rFonts w:ascii="Courier New" w:hAnsi="Courier New" w:hint="default"/>
+        <w:sz w:val="20"/>
+      </w:rPr>
+    </w:lvl>
+    <w:lvl w:ilvl="2" w:tentative="1">
+      <w:start w:val="1"/>
+      <w:numFmt w:val="bullet"/>
+      <w:lvlText w:val=""/>
+      <w:lvlJc w:val="left"/>
+      <w:pPr>
+        <w:tabs>
+          <w:tab w:val="num" w:pos="2160"/>
+        </w:tabs>
+        <w:ind w:left="2160" w:hanging="360"/>
+      </w:pPr>
+      <w:rPr>
+        <w:rFonts w:ascii="Wingdings" w:hAnsi="Wingdings" w:hint="default"/>
+        <w:sz w:val="20"/>
+      </w:rPr>
+    </w:lvl>
+    <w:lvl w:ilvl="3" w:tentative="1">
+      <w:start w:val="1"/>
+      <w:numFmt w:val="bullet"/>
+      <w:lvlText w:val=""/>
+      <w:lvlJc w:val="left"/>
+      <w:pPr>
+        <w:tabs>
+          <w:tab w:val="num" w:pos="2880"/>
+        </w:tabs>
+        <w:ind w:left="2880" w:hanging="360"/>
+      </w:pPr>
+      <w:rPr>
+        <w:rFonts w:ascii="Wingdings" w:hAnsi="Wingdings" w:hint="default"/>
+        <w:sz w:val="20"/>
+      </w:rPr>
+    </w:lvl>
+    <w:lvl w:ilvl="4" w:tentative="1">
+      <w:start w:val="1"/>
+      <w:numFmt w:val="bullet"/>
+      <w:lvlText w:val=""/>
+      <w:lvlJc w:val="left"/>
+      <w:pPr>
+        <w:tabs>
+          <w:tab w:val="num" w:pos="3600"/>
+        </w:tabs>
+        <w:ind w:left="3600" w:hanging="360"/>
+      </w:pPr>
+      <w:rPr>
+        <w:rFonts w:ascii="Wingdings" w:hAnsi="Wingdings" w:hint="default"/>
+        <w:sz w:val="20"/>
+      </w:rPr>
+    </w:lvl>
+    <w:lvl w:ilvl="5" w:tentative="1">
+      <w:start w:val="1"/>
+      <w:numFmt w:val="bullet"/>
+      <w:lvlText w:val=""/>
+      <w:lvlJc w:val="left"/>
+      <w:pPr>
+        <w:tabs>
+          <w:tab w:val="num" w:pos="4320"/>
+        </w:tabs>
+        <w:ind w:left="4320" w:hanging="360"/>
+      </w:pPr>
+      <w:rPr>
+        <w:rFonts w:ascii="Wingdings" w:hAnsi="Wingdings" w:hint="default"/>
+        <w:sz w:val="20"/>
+      </w:rPr>
+    </w:lvl>
+    <w:lvl w:ilvl="6" w:tentative="1">
+      <w:start w:val="1"/>
+      <w:numFmt w:val="bullet"/>
+      <w:lvlText w:val=""/>
+      <w:lvlJc w:val="left"/>
+      <w:pPr>
+        <w:tabs>
+          <w:tab w:val="num" w:pos="5040"/>
+        </w:tabs>
+        <w:ind w:left="5040" w:hanging="360"/>
+      </w:pPr>
+      <w:rPr>
+        <w:rFonts w:ascii="Wingdings" w:hAnsi="Wingdings" w:hint="default"/>
+        <w:sz w:val="20"/>
+      </w:rPr>
+    </w:lvl>
+    <w:lvl w:ilvl="7" w:tentative="1">
+      <w:start w:val="1"/>
+      <w:numFmt w:val="bullet"/>
+      <w:lvlText w:val=""/>
+      <w:lvlJc w:val="left"/>
+      <w:pPr>
+        <w:tabs>
+          <w:tab w:val="num" w:pos="5760"/>
+        </w:tabs>
+        <w:ind w:left="5760" w:hanging="360"/>
+      </w:pPr>
+      <w:rPr>
+        <w:rFonts w:ascii="Wingdings" w:hAnsi="Wingdings" w:hint="default"/>
+        <w:sz w:val="20"/>
+      </w:rPr>
+    </w:lvl>
+    <w:lvl w:ilvl="8" w:tentative="1">
+      <w:start w:val="1"/>
+      <w:numFmt w:val="bullet"/>
+      <w:lvlText w:val=""/>
+      <w:lvlJc w:val="left"/>
+      <w:pPr>
+        <w:tabs>
+          <w:tab w:val="num" w:pos="6480"/>
+        </w:tabs>
+        <w:ind w:left="6480" w:hanging="360"/>
+      </w:pPr>
+      <w:rPr>
+        <w:rFonts w:ascii="Wingdings" w:hAnsi="Wingdings" w:hint="default"/>
+        <w:sz w:val="20"/>
+      </w:rPr>
+    </w:lvl>
+  </w:abstractNum>
+  <w:abstractNum w:abstractNumId="3" w15:restartNumberingAfterBreak="0">
+    <w:nsid w:val="0BB560CE"/>
+    <w:multiLevelType w:val="multilevel"/>
+    <w:tmpl w:val="0E8EDF20"/>
+    <w:lvl w:ilvl="0">
+      <w:start w:val="1"/>
+      <w:numFmt w:val="bullet"/>
+      <w:lvlText w:val=""/>
+      <w:lvlJc w:val="left"/>
+      <w:pPr>
+        <w:tabs>
+          <w:tab w:val="num" w:pos="720"/>
+        </w:tabs>
+        <w:ind w:left="720" w:hanging="360"/>
+      </w:pPr>
+      <w:rPr>
+        <w:rFonts w:ascii="Symbol" w:hAnsi="Symbol" w:hint="default"/>
+        <w:sz w:val="20"/>
+      </w:rPr>
+    </w:lvl>
+    <w:lvl w:ilvl="1" w:tentative="1">
+      <w:start w:val="1"/>
+      <w:numFmt w:val="bullet"/>
+      <w:lvlText w:val="o"/>
+      <w:lvlJc w:val="left"/>
+      <w:pPr>
+        <w:tabs>
+          <w:tab w:val="num" w:pos="1440"/>
+        </w:tabs>
+        <w:ind w:left="1440" w:hanging="360"/>
+      </w:pPr>
+      <w:rPr>
+        <w:rFonts w:ascii="Courier New" w:hAnsi="Courier New" w:hint="default"/>
+        <w:sz w:val="20"/>
+      </w:rPr>
+    </w:lvl>
+    <w:lvl w:ilvl="2" w:tentative="1">
+      <w:start w:val="1"/>
+      <w:numFmt w:val="bullet"/>
+      <w:lvlText w:val=""/>
+      <w:lvlJc w:val="left"/>
+      <w:pPr>
+        <w:tabs>
+          <w:tab w:val="num" w:pos="2160"/>
+        </w:tabs>
+        <w:ind w:left="2160" w:hanging="360"/>
+      </w:pPr>
+      <w:rPr>
+        <w:rFonts w:ascii="Wingdings" w:hAnsi="Wingdings" w:hint="default"/>
+        <w:sz w:val="20"/>
+      </w:rPr>
+    </w:lvl>
+    <w:lvl w:ilvl="3" w:tentative="1">
+      <w:start w:val="1"/>
+      <w:numFmt w:val="bullet"/>
+      <w:lvlText w:val=""/>
+      <w:lvlJc w:val="left"/>
+      <w:pPr>
+        <w:tabs>
+          <w:tab w:val="num" w:pos="2880"/>
+        </w:tabs>
+        <w:ind w:left="2880" w:hanging="360"/>
+      </w:pPr>
+      <w:rPr>
+        <w:rFonts w:ascii="Wingdings" w:hAnsi="Wingdings" w:hint="default"/>
+        <w:sz w:val="20"/>
+      </w:rPr>
+    </w:lvl>
+    <w:lvl w:ilvl="4" w:tentative="1">
+      <w:start w:val="1"/>
+      <w:numFmt w:val="bullet"/>
+      <w:lvlText w:val=""/>
+      <w:lvlJc w:val="left"/>
+      <w:pPr>
+        <w:tabs>
+          <w:tab w:val="num" w:pos="3600"/>
+        </w:tabs>
+        <w:ind w:left="3600" w:hanging="360"/>
+      </w:pPr>
+      <w:rPr>
+        <w:rFonts w:ascii="Wingdings" w:hAnsi="Wingdings" w:hint="default"/>
+        <w:sz w:val="20"/>
+      </w:rPr>
+    </w:lvl>
+    <w:lvl w:ilvl="5" w:tentative="1">
+      <w:start w:val="1"/>
+      <w:numFmt w:val="bullet"/>
+      <w:lvlText w:val=""/>
+      <w:lvlJc w:val="left"/>
+      <w:pPr>
+        <w:tabs>
+          <w:tab w:val="num" w:pos="4320"/>
+        </w:tabs>
+        <w:ind w:left="4320" w:hanging="360"/>
+      </w:pPr>
+      <w:rPr>
+        <w:rFonts w:ascii="Wingdings" w:hAnsi="Wingdings" w:hint="default"/>
+        <w:sz w:val="20"/>
+      </w:rPr>
+    </w:lvl>
+    <w:lvl w:ilvl="6" w:tentative="1">
+      <w:start w:val="1"/>
+      <w:numFmt w:val="bullet"/>
+      <w:lvlText w:val=""/>
+      <w:lvlJc w:val="left"/>
+      <w:pPr>
+        <w:tabs>
+          <w:tab w:val="num" w:pos="5040"/>
+        </w:tabs>
+        <w:ind w:left="5040" w:hanging="360"/>
+      </w:pPr>
+      <w:rPr>
+        <w:rFonts w:ascii="Wingdings" w:hAnsi="Wingdings" w:hint="default"/>
+        <w:sz w:val="20"/>
+      </w:rPr>
+    </w:lvl>
+    <w:lvl w:ilvl="7" w:tentative="1">
+      <w:start w:val="1"/>
+      <w:numFmt w:val="bullet"/>
+      <w:lvlText w:val=""/>
+      <w:lvlJc w:val="left"/>
+      <w:pPr>
+        <w:tabs>
+          <w:tab w:val="num" w:pos="5760"/>
+        </w:tabs>
+        <w:ind w:left="5760" w:hanging="360"/>
+      </w:pPr>
+      <w:rPr>
+        <w:rFonts w:ascii="Wingdings" w:hAnsi="Wingdings" w:hint="default"/>
+        <w:sz w:val="20"/>
+      </w:rPr>
+    </w:lvl>
+    <w:lvl w:ilvl="8" w:tentative="1">
+      <w:start w:val="1"/>
+      <w:numFmt w:val="bullet"/>
+      <w:lvlText w:val=""/>
+      <w:lvlJc w:val="left"/>
+      <w:pPr>
+        <w:tabs>
+          <w:tab w:val="num" w:pos="6480"/>
+        </w:tabs>
+        <w:ind w:left="6480" w:hanging="360"/>
+      </w:pPr>
+      <w:rPr>
+        <w:rFonts w:ascii="Wingdings" w:hAnsi="Wingdings" w:hint="default"/>
+        <w:sz w:val="20"/>
+      </w:rPr>
+    </w:lvl>
+  </w:abstractNum>
+  <w:abstractNum w:abstractNumId="4" w15:restartNumberingAfterBreak="0">
     <w:nsid w:val="0D6C2A56"/>
     <w:multiLevelType w:val="multilevel"/>
     <w:tmpl w:val="DFD0E6BA"/>
@@ -6240,7 +8328,7 @@
       </w:rPr>
     </w:lvl>
   </w:abstractNum>
-  <w:abstractNum w:abstractNumId="3" w15:restartNumberingAfterBreak="0">
+  <w:abstractNum w:abstractNumId="5" w15:restartNumberingAfterBreak="0">
     <w:nsid w:val="0EA047BA"/>
     <w:multiLevelType w:val="multilevel"/>
     <w:tmpl w:val="D43C91BC"/>
@@ -6389,7 +8477,454 @@
       </w:rPr>
     </w:lvl>
   </w:abstractNum>
-  <w:abstractNum w:abstractNumId="4" w15:restartNumberingAfterBreak="0">
+  <w:abstractNum w:abstractNumId="6" w15:restartNumberingAfterBreak="0">
+    <w:nsid w:val="169B5C12"/>
+    <w:multiLevelType w:val="multilevel"/>
+    <w:tmpl w:val="B1C2D796"/>
+    <w:lvl w:ilvl="0">
+      <w:start w:val="1"/>
+      <w:numFmt w:val="bullet"/>
+      <w:lvlText w:val=""/>
+      <w:lvlJc w:val="left"/>
+      <w:pPr>
+        <w:tabs>
+          <w:tab w:val="num" w:pos="720"/>
+        </w:tabs>
+        <w:ind w:left="720" w:hanging="360"/>
+      </w:pPr>
+      <w:rPr>
+        <w:rFonts w:ascii="Symbol" w:hAnsi="Symbol" w:hint="default"/>
+        <w:sz w:val="20"/>
+      </w:rPr>
+    </w:lvl>
+    <w:lvl w:ilvl="1" w:tentative="1">
+      <w:start w:val="1"/>
+      <w:numFmt w:val="bullet"/>
+      <w:lvlText w:val="o"/>
+      <w:lvlJc w:val="left"/>
+      <w:pPr>
+        <w:tabs>
+          <w:tab w:val="num" w:pos="1440"/>
+        </w:tabs>
+        <w:ind w:left="1440" w:hanging="360"/>
+      </w:pPr>
+      <w:rPr>
+        <w:rFonts w:ascii="Courier New" w:hAnsi="Courier New" w:hint="default"/>
+        <w:sz w:val="20"/>
+      </w:rPr>
+    </w:lvl>
+    <w:lvl w:ilvl="2" w:tentative="1">
+      <w:start w:val="1"/>
+      <w:numFmt w:val="bullet"/>
+      <w:lvlText w:val=""/>
+      <w:lvlJc w:val="left"/>
+      <w:pPr>
+        <w:tabs>
+          <w:tab w:val="num" w:pos="2160"/>
+        </w:tabs>
+        <w:ind w:left="2160" w:hanging="360"/>
+      </w:pPr>
+      <w:rPr>
+        <w:rFonts w:ascii="Wingdings" w:hAnsi="Wingdings" w:hint="default"/>
+        <w:sz w:val="20"/>
+      </w:rPr>
+    </w:lvl>
+    <w:lvl w:ilvl="3" w:tentative="1">
+      <w:start w:val="1"/>
+      <w:numFmt w:val="bullet"/>
+      <w:lvlText w:val=""/>
+      <w:lvlJc w:val="left"/>
+      <w:pPr>
+        <w:tabs>
+          <w:tab w:val="num" w:pos="2880"/>
+        </w:tabs>
+        <w:ind w:left="2880" w:hanging="360"/>
+      </w:pPr>
+      <w:rPr>
+        <w:rFonts w:ascii="Wingdings" w:hAnsi="Wingdings" w:hint="default"/>
+        <w:sz w:val="20"/>
+      </w:rPr>
+    </w:lvl>
+    <w:lvl w:ilvl="4" w:tentative="1">
+      <w:start w:val="1"/>
+      <w:numFmt w:val="bullet"/>
+      <w:lvlText w:val=""/>
+      <w:lvlJc w:val="left"/>
+      <w:pPr>
+        <w:tabs>
+          <w:tab w:val="num" w:pos="3600"/>
+        </w:tabs>
+        <w:ind w:left="3600" w:hanging="360"/>
+      </w:pPr>
+      <w:rPr>
+        <w:rFonts w:ascii="Wingdings" w:hAnsi="Wingdings" w:hint="default"/>
+        <w:sz w:val="20"/>
+      </w:rPr>
+    </w:lvl>
+    <w:lvl w:ilvl="5" w:tentative="1">
+      <w:start w:val="1"/>
+      <w:numFmt w:val="bullet"/>
+      <w:lvlText w:val=""/>
+      <w:lvlJc w:val="left"/>
+      <w:pPr>
+        <w:tabs>
+          <w:tab w:val="num" w:pos="4320"/>
+        </w:tabs>
+        <w:ind w:left="4320" w:hanging="360"/>
+      </w:pPr>
+      <w:rPr>
+        <w:rFonts w:ascii="Wingdings" w:hAnsi="Wingdings" w:hint="default"/>
+        <w:sz w:val="20"/>
+      </w:rPr>
+    </w:lvl>
+    <w:lvl w:ilvl="6" w:tentative="1">
+      <w:start w:val="1"/>
+      <w:numFmt w:val="bullet"/>
+      <w:lvlText w:val=""/>
+      <w:lvlJc w:val="left"/>
+      <w:pPr>
+        <w:tabs>
+          <w:tab w:val="num" w:pos="5040"/>
+        </w:tabs>
+        <w:ind w:left="5040" w:hanging="360"/>
+      </w:pPr>
+      <w:rPr>
+        <w:rFonts w:ascii="Wingdings" w:hAnsi="Wingdings" w:hint="default"/>
+        <w:sz w:val="20"/>
+      </w:rPr>
+    </w:lvl>
+    <w:lvl w:ilvl="7" w:tentative="1">
+      <w:start w:val="1"/>
+      <w:numFmt w:val="bullet"/>
+      <w:lvlText w:val=""/>
+      <w:lvlJc w:val="left"/>
+      <w:pPr>
+        <w:tabs>
+          <w:tab w:val="num" w:pos="5760"/>
+        </w:tabs>
+        <w:ind w:left="5760" w:hanging="360"/>
+      </w:pPr>
+      <w:rPr>
+        <w:rFonts w:ascii="Wingdings" w:hAnsi="Wingdings" w:hint="default"/>
+        <w:sz w:val="20"/>
+      </w:rPr>
+    </w:lvl>
+    <w:lvl w:ilvl="8" w:tentative="1">
+      <w:start w:val="1"/>
+      <w:numFmt w:val="bullet"/>
+      <w:lvlText w:val=""/>
+      <w:lvlJc w:val="left"/>
+      <w:pPr>
+        <w:tabs>
+          <w:tab w:val="num" w:pos="6480"/>
+        </w:tabs>
+        <w:ind w:left="6480" w:hanging="360"/>
+      </w:pPr>
+      <w:rPr>
+        <w:rFonts w:ascii="Wingdings" w:hAnsi="Wingdings" w:hint="default"/>
+        <w:sz w:val="20"/>
+      </w:rPr>
+    </w:lvl>
+  </w:abstractNum>
+  <w:abstractNum w:abstractNumId="7" w15:restartNumberingAfterBreak="0">
+    <w:nsid w:val="16B60608"/>
+    <w:multiLevelType w:val="multilevel"/>
+    <w:tmpl w:val="FBBC28DE"/>
+    <w:lvl w:ilvl="0">
+      <w:start w:val="1"/>
+      <w:numFmt w:val="bullet"/>
+      <w:lvlText w:val=""/>
+      <w:lvlJc w:val="left"/>
+      <w:pPr>
+        <w:tabs>
+          <w:tab w:val="num" w:pos="720"/>
+        </w:tabs>
+        <w:ind w:left="720" w:hanging="360"/>
+      </w:pPr>
+      <w:rPr>
+        <w:rFonts w:ascii="Symbol" w:hAnsi="Symbol" w:hint="default"/>
+        <w:sz w:val="20"/>
+      </w:rPr>
+    </w:lvl>
+    <w:lvl w:ilvl="1" w:tentative="1">
+      <w:start w:val="1"/>
+      <w:numFmt w:val="bullet"/>
+      <w:lvlText w:val="o"/>
+      <w:lvlJc w:val="left"/>
+      <w:pPr>
+        <w:tabs>
+          <w:tab w:val="num" w:pos="1440"/>
+        </w:tabs>
+        <w:ind w:left="1440" w:hanging="360"/>
+      </w:pPr>
+      <w:rPr>
+        <w:rFonts w:ascii="Courier New" w:hAnsi="Courier New" w:hint="default"/>
+        <w:sz w:val="20"/>
+      </w:rPr>
+    </w:lvl>
+    <w:lvl w:ilvl="2" w:tentative="1">
+      <w:start w:val="1"/>
+      <w:numFmt w:val="bullet"/>
+      <w:lvlText w:val=""/>
+      <w:lvlJc w:val="left"/>
+      <w:pPr>
+        <w:tabs>
+          <w:tab w:val="num" w:pos="2160"/>
+        </w:tabs>
+        <w:ind w:left="2160" w:hanging="360"/>
+      </w:pPr>
+      <w:rPr>
+        <w:rFonts w:ascii="Wingdings" w:hAnsi="Wingdings" w:hint="default"/>
+        <w:sz w:val="20"/>
+      </w:rPr>
+    </w:lvl>
+    <w:lvl w:ilvl="3" w:tentative="1">
+      <w:start w:val="1"/>
+      <w:numFmt w:val="bullet"/>
+      <w:lvlText w:val=""/>
+      <w:lvlJc w:val="left"/>
+      <w:pPr>
+        <w:tabs>
+          <w:tab w:val="num" w:pos="2880"/>
+        </w:tabs>
+        <w:ind w:left="2880" w:hanging="360"/>
+      </w:pPr>
+      <w:rPr>
+        <w:rFonts w:ascii="Wingdings" w:hAnsi="Wingdings" w:hint="default"/>
+        <w:sz w:val="20"/>
+      </w:rPr>
+    </w:lvl>
+    <w:lvl w:ilvl="4" w:tentative="1">
+      <w:start w:val="1"/>
+      <w:numFmt w:val="bullet"/>
+      <w:lvlText w:val=""/>
+      <w:lvlJc w:val="left"/>
+      <w:pPr>
+        <w:tabs>
+          <w:tab w:val="num" w:pos="3600"/>
+        </w:tabs>
+        <w:ind w:left="3600" w:hanging="360"/>
+      </w:pPr>
+      <w:rPr>
+        <w:rFonts w:ascii="Wingdings" w:hAnsi="Wingdings" w:hint="default"/>
+        <w:sz w:val="20"/>
+      </w:rPr>
+    </w:lvl>
+    <w:lvl w:ilvl="5" w:tentative="1">
+      <w:start w:val="1"/>
+      <w:numFmt w:val="bullet"/>
+      <w:lvlText w:val=""/>
+      <w:lvlJc w:val="left"/>
+      <w:pPr>
+        <w:tabs>
+          <w:tab w:val="num" w:pos="4320"/>
+        </w:tabs>
+        <w:ind w:left="4320" w:hanging="360"/>
+      </w:pPr>
+      <w:rPr>
+        <w:rFonts w:ascii="Wingdings" w:hAnsi="Wingdings" w:hint="default"/>
+        <w:sz w:val="20"/>
+      </w:rPr>
+    </w:lvl>
+    <w:lvl w:ilvl="6" w:tentative="1">
+      <w:start w:val="1"/>
+      <w:numFmt w:val="bullet"/>
+      <w:lvlText w:val=""/>
+      <w:lvlJc w:val="left"/>
+      <w:pPr>
+        <w:tabs>
+          <w:tab w:val="num" w:pos="5040"/>
+        </w:tabs>
+        <w:ind w:left="5040" w:hanging="360"/>
+      </w:pPr>
+      <w:rPr>
+        <w:rFonts w:ascii="Wingdings" w:hAnsi="Wingdings" w:hint="default"/>
+        <w:sz w:val="20"/>
+      </w:rPr>
+    </w:lvl>
+    <w:lvl w:ilvl="7" w:tentative="1">
+      <w:start w:val="1"/>
+      <w:numFmt w:val="bullet"/>
+      <w:lvlText w:val=""/>
+      <w:lvlJc w:val="left"/>
+      <w:pPr>
+        <w:tabs>
+          <w:tab w:val="num" w:pos="5760"/>
+        </w:tabs>
+        <w:ind w:left="5760" w:hanging="360"/>
+      </w:pPr>
+      <w:rPr>
+        <w:rFonts w:ascii="Wingdings" w:hAnsi="Wingdings" w:hint="default"/>
+        <w:sz w:val="20"/>
+      </w:rPr>
+    </w:lvl>
+    <w:lvl w:ilvl="8" w:tentative="1">
+      <w:start w:val="1"/>
+      <w:numFmt w:val="bullet"/>
+      <w:lvlText w:val=""/>
+      <w:lvlJc w:val="left"/>
+      <w:pPr>
+        <w:tabs>
+          <w:tab w:val="num" w:pos="6480"/>
+        </w:tabs>
+        <w:ind w:left="6480" w:hanging="360"/>
+      </w:pPr>
+      <w:rPr>
+        <w:rFonts w:ascii="Wingdings" w:hAnsi="Wingdings" w:hint="default"/>
+        <w:sz w:val="20"/>
+      </w:rPr>
+    </w:lvl>
+  </w:abstractNum>
+  <w:abstractNum w:abstractNumId="8" w15:restartNumberingAfterBreak="0">
+    <w:nsid w:val="1C6F74C2"/>
+    <w:multiLevelType w:val="multilevel"/>
+    <w:tmpl w:val="1A081564"/>
+    <w:lvl w:ilvl="0">
+      <w:start w:val="1"/>
+      <w:numFmt w:val="bullet"/>
+      <w:lvlText w:val=""/>
+      <w:lvlJc w:val="left"/>
+      <w:pPr>
+        <w:tabs>
+          <w:tab w:val="num" w:pos="720"/>
+        </w:tabs>
+        <w:ind w:left="720" w:hanging="360"/>
+      </w:pPr>
+      <w:rPr>
+        <w:rFonts w:ascii="Symbol" w:hAnsi="Symbol" w:hint="default"/>
+        <w:sz w:val="20"/>
+      </w:rPr>
+    </w:lvl>
+    <w:lvl w:ilvl="1">
+      <w:start w:val="1"/>
+      <w:numFmt w:val="bullet"/>
+      <w:lvlText w:val="o"/>
+      <w:lvlJc w:val="left"/>
+      <w:pPr>
+        <w:tabs>
+          <w:tab w:val="num" w:pos="1440"/>
+        </w:tabs>
+        <w:ind w:left="1440" w:hanging="360"/>
+      </w:pPr>
+      <w:rPr>
+        <w:rFonts w:ascii="Courier New" w:hAnsi="Courier New" w:hint="default"/>
+        <w:sz w:val="20"/>
+      </w:rPr>
+    </w:lvl>
+    <w:lvl w:ilvl="2" w:tentative="1">
+      <w:start w:val="1"/>
+      <w:numFmt w:val="bullet"/>
+      <w:lvlText w:val=""/>
+      <w:lvlJc w:val="left"/>
+      <w:pPr>
+        <w:tabs>
+          <w:tab w:val="num" w:pos="2160"/>
+        </w:tabs>
+        <w:ind w:left="2160" w:hanging="360"/>
+      </w:pPr>
+      <w:rPr>
+        <w:rFonts w:ascii="Wingdings" w:hAnsi="Wingdings" w:hint="default"/>
+        <w:sz w:val="20"/>
+      </w:rPr>
+    </w:lvl>
+    <w:lvl w:ilvl="3" w:tentative="1">
+      <w:start w:val="1"/>
+      <w:numFmt w:val="bullet"/>
+      <w:lvlText w:val=""/>
+      <w:lvlJc w:val="left"/>
+      <w:pPr>
+        <w:tabs>
+          <w:tab w:val="num" w:pos="2880"/>
+        </w:tabs>
+        <w:ind w:left="2880" w:hanging="360"/>
+      </w:pPr>
+      <w:rPr>
+        <w:rFonts w:ascii="Wingdings" w:hAnsi="Wingdings" w:hint="default"/>
+        <w:sz w:val="20"/>
+      </w:rPr>
+    </w:lvl>
+    <w:lvl w:ilvl="4" w:tentative="1">
+      <w:start w:val="1"/>
+      <w:numFmt w:val="bullet"/>
+      <w:lvlText w:val=""/>
+      <w:lvlJc w:val="left"/>
+      <w:pPr>
+        <w:tabs>
+          <w:tab w:val="num" w:pos="3600"/>
+        </w:tabs>
+        <w:ind w:left="3600" w:hanging="360"/>
+      </w:pPr>
+      <w:rPr>
+        <w:rFonts w:ascii="Wingdings" w:hAnsi="Wingdings" w:hint="default"/>
+        <w:sz w:val="20"/>
+      </w:rPr>
+    </w:lvl>
+    <w:lvl w:ilvl="5" w:tentative="1">
+      <w:start w:val="1"/>
+      <w:numFmt w:val="bullet"/>
+      <w:lvlText w:val=""/>
+      <w:lvlJc w:val="left"/>
+      <w:pPr>
+        <w:tabs>
+          <w:tab w:val="num" w:pos="4320"/>
+        </w:tabs>
+        <w:ind w:left="4320" w:hanging="360"/>
+      </w:pPr>
+      <w:rPr>
+        <w:rFonts w:ascii="Wingdings" w:hAnsi="Wingdings" w:hint="default"/>
+        <w:sz w:val="20"/>
+      </w:rPr>
+    </w:lvl>
+    <w:lvl w:ilvl="6" w:tentative="1">
+      <w:start w:val="1"/>
+      <w:numFmt w:val="bullet"/>
+      <w:lvlText w:val=""/>
+      <w:lvlJc w:val="left"/>
+      <w:pPr>
+        <w:tabs>
+          <w:tab w:val="num" w:pos="5040"/>
+        </w:tabs>
+        <w:ind w:left="5040" w:hanging="360"/>
+      </w:pPr>
+      <w:rPr>
+        <w:rFonts w:ascii="Wingdings" w:hAnsi="Wingdings" w:hint="default"/>
+        <w:sz w:val="20"/>
+      </w:rPr>
+    </w:lvl>
+    <w:lvl w:ilvl="7" w:tentative="1">
+      <w:start w:val="1"/>
+      <w:numFmt w:val="bullet"/>
+      <w:lvlText w:val=""/>
+      <w:lvlJc w:val="left"/>
+      <w:pPr>
+        <w:tabs>
+          <w:tab w:val="num" w:pos="5760"/>
+        </w:tabs>
+        <w:ind w:left="5760" w:hanging="360"/>
+      </w:pPr>
+      <w:rPr>
+        <w:rFonts w:ascii="Wingdings" w:hAnsi="Wingdings" w:hint="default"/>
+        <w:sz w:val="20"/>
+      </w:rPr>
+    </w:lvl>
+    <w:lvl w:ilvl="8" w:tentative="1">
+      <w:start w:val="1"/>
+      <w:numFmt w:val="bullet"/>
+      <w:lvlText w:val=""/>
+      <w:lvlJc w:val="left"/>
+      <w:pPr>
+        <w:tabs>
+          <w:tab w:val="num" w:pos="6480"/>
+        </w:tabs>
+        <w:ind w:left="6480" w:hanging="360"/>
+      </w:pPr>
+      <w:rPr>
+        <w:rFonts w:ascii="Wingdings" w:hAnsi="Wingdings" w:hint="default"/>
+        <w:sz w:val="20"/>
+      </w:rPr>
+    </w:lvl>
+  </w:abstractNum>
+  <w:abstractNum w:abstractNumId="9" w15:restartNumberingAfterBreak="0">
     <w:nsid w:val="1D086CDE"/>
     <w:multiLevelType w:val="multilevel"/>
     <w:tmpl w:val="8BE8A7B8"/>
@@ -6538,7 +9073,156 @@
       </w:rPr>
     </w:lvl>
   </w:abstractNum>
-  <w:abstractNum w:abstractNumId="5" w15:restartNumberingAfterBreak="0">
+  <w:abstractNum w:abstractNumId="10" w15:restartNumberingAfterBreak="0">
+    <w:nsid w:val="209104C5"/>
+    <w:multiLevelType w:val="multilevel"/>
+    <w:tmpl w:val="5A446B6A"/>
+    <w:lvl w:ilvl="0">
+      <w:start w:val="1"/>
+      <w:numFmt w:val="bullet"/>
+      <w:lvlText w:val=""/>
+      <w:lvlJc w:val="left"/>
+      <w:pPr>
+        <w:tabs>
+          <w:tab w:val="num" w:pos="720"/>
+        </w:tabs>
+        <w:ind w:left="720" w:hanging="360"/>
+      </w:pPr>
+      <w:rPr>
+        <w:rFonts w:ascii="Symbol" w:hAnsi="Symbol" w:hint="default"/>
+        <w:sz w:val="20"/>
+      </w:rPr>
+    </w:lvl>
+    <w:lvl w:ilvl="1">
+      <w:start w:val="1"/>
+      <w:numFmt w:val="bullet"/>
+      <w:lvlText w:val="o"/>
+      <w:lvlJc w:val="left"/>
+      <w:pPr>
+        <w:tabs>
+          <w:tab w:val="num" w:pos="1440"/>
+        </w:tabs>
+        <w:ind w:left="1440" w:hanging="360"/>
+      </w:pPr>
+      <w:rPr>
+        <w:rFonts w:ascii="Courier New" w:hAnsi="Courier New" w:hint="default"/>
+        <w:sz w:val="20"/>
+      </w:rPr>
+    </w:lvl>
+    <w:lvl w:ilvl="2" w:tentative="1">
+      <w:start w:val="1"/>
+      <w:numFmt w:val="bullet"/>
+      <w:lvlText w:val=""/>
+      <w:lvlJc w:val="left"/>
+      <w:pPr>
+        <w:tabs>
+          <w:tab w:val="num" w:pos="2160"/>
+        </w:tabs>
+        <w:ind w:left="2160" w:hanging="360"/>
+      </w:pPr>
+      <w:rPr>
+        <w:rFonts w:ascii="Wingdings" w:hAnsi="Wingdings" w:hint="default"/>
+        <w:sz w:val="20"/>
+      </w:rPr>
+    </w:lvl>
+    <w:lvl w:ilvl="3" w:tentative="1">
+      <w:start w:val="1"/>
+      <w:numFmt w:val="bullet"/>
+      <w:lvlText w:val=""/>
+      <w:lvlJc w:val="left"/>
+      <w:pPr>
+        <w:tabs>
+          <w:tab w:val="num" w:pos="2880"/>
+        </w:tabs>
+        <w:ind w:left="2880" w:hanging="360"/>
+      </w:pPr>
+      <w:rPr>
+        <w:rFonts w:ascii="Wingdings" w:hAnsi="Wingdings" w:hint="default"/>
+        <w:sz w:val="20"/>
+      </w:rPr>
+    </w:lvl>
+    <w:lvl w:ilvl="4" w:tentative="1">
+      <w:start w:val="1"/>
+      <w:numFmt w:val="bullet"/>
+      <w:lvlText w:val=""/>
+      <w:lvlJc w:val="left"/>
+      <w:pPr>
+        <w:tabs>
+          <w:tab w:val="num" w:pos="3600"/>
+        </w:tabs>
+        <w:ind w:left="3600" w:hanging="360"/>
+      </w:pPr>
+      <w:rPr>
+        <w:rFonts w:ascii="Wingdings" w:hAnsi="Wingdings" w:hint="default"/>
+        <w:sz w:val="20"/>
+      </w:rPr>
+    </w:lvl>
+    <w:lvl w:ilvl="5" w:tentative="1">
+      <w:start w:val="1"/>
+      <w:numFmt w:val="bullet"/>
+      <w:lvlText w:val=""/>
+      <w:lvlJc w:val="left"/>
+      <w:pPr>
+        <w:tabs>
+          <w:tab w:val="num" w:pos="4320"/>
+        </w:tabs>
+        <w:ind w:left="4320" w:hanging="360"/>
+      </w:pPr>
+      <w:rPr>
+        <w:rFonts w:ascii="Wingdings" w:hAnsi="Wingdings" w:hint="default"/>
+        <w:sz w:val="20"/>
+      </w:rPr>
+    </w:lvl>
+    <w:lvl w:ilvl="6" w:tentative="1">
+      <w:start w:val="1"/>
+      <w:numFmt w:val="bullet"/>
+      <w:lvlText w:val=""/>
+      <w:lvlJc w:val="left"/>
+      <w:pPr>
+        <w:tabs>
+          <w:tab w:val="num" w:pos="5040"/>
+        </w:tabs>
+        <w:ind w:left="5040" w:hanging="360"/>
+      </w:pPr>
+      <w:rPr>
+        <w:rFonts w:ascii="Wingdings" w:hAnsi="Wingdings" w:hint="default"/>
+        <w:sz w:val="20"/>
+      </w:rPr>
+    </w:lvl>
+    <w:lvl w:ilvl="7" w:tentative="1">
+      <w:start w:val="1"/>
+      <w:numFmt w:val="bullet"/>
+      <w:lvlText w:val=""/>
+      <w:lvlJc w:val="left"/>
+      <w:pPr>
+        <w:tabs>
+          <w:tab w:val="num" w:pos="5760"/>
+        </w:tabs>
+        <w:ind w:left="5760" w:hanging="360"/>
+      </w:pPr>
+      <w:rPr>
+        <w:rFonts w:ascii="Wingdings" w:hAnsi="Wingdings" w:hint="default"/>
+        <w:sz w:val="20"/>
+      </w:rPr>
+    </w:lvl>
+    <w:lvl w:ilvl="8" w:tentative="1">
+      <w:start w:val="1"/>
+      <w:numFmt w:val="bullet"/>
+      <w:lvlText w:val=""/>
+      <w:lvlJc w:val="left"/>
+      <w:pPr>
+        <w:tabs>
+          <w:tab w:val="num" w:pos="6480"/>
+        </w:tabs>
+        <w:ind w:left="6480" w:hanging="360"/>
+      </w:pPr>
+      <w:rPr>
+        <w:rFonts w:ascii="Wingdings" w:hAnsi="Wingdings" w:hint="default"/>
+        <w:sz w:val="20"/>
+      </w:rPr>
+    </w:lvl>
+  </w:abstractNum>
+  <w:abstractNum w:abstractNumId="11" w15:restartNumberingAfterBreak="0">
     <w:nsid w:val="2182221E"/>
     <w:multiLevelType w:val="multilevel"/>
     <w:tmpl w:val="FD880C20"/>
@@ -6651,7 +9335,7 @@
       </w:pPr>
     </w:lvl>
   </w:abstractNum>
-  <w:abstractNum w:abstractNumId="6" w15:restartNumberingAfterBreak="0">
+  <w:abstractNum w:abstractNumId="12" w15:restartNumberingAfterBreak="0">
     <w:nsid w:val="24312E8D"/>
     <w:multiLevelType w:val="multilevel"/>
     <w:tmpl w:val="0A0E0C52"/>
@@ -6800,7 +9484,7 @@
       </w:rPr>
     </w:lvl>
   </w:abstractNum>
-  <w:abstractNum w:abstractNumId="7" w15:restartNumberingAfterBreak="0">
+  <w:abstractNum w:abstractNumId="13" w15:restartNumberingAfterBreak="0">
     <w:nsid w:val="2B2564E4"/>
     <w:multiLevelType w:val="multilevel"/>
     <w:tmpl w:val="9942F470"/>
@@ -6949,7 +9633,454 @@
       </w:rPr>
     </w:lvl>
   </w:abstractNum>
-  <w:abstractNum w:abstractNumId="8" w15:restartNumberingAfterBreak="0">
+  <w:abstractNum w:abstractNumId="14" w15:restartNumberingAfterBreak="0">
+    <w:nsid w:val="2B470A60"/>
+    <w:multiLevelType w:val="multilevel"/>
+    <w:tmpl w:val="9252E2F4"/>
+    <w:lvl w:ilvl="0">
+      <w:start w:val="1"/>
+      <w:numFmt w:val="bullet"/>
+      <w:lvlText w:val=""/>
+      <w:lvlJc w:val="left"/>
+      <w:pPr>
+        <w:tabs>
+          <w:tab w:val="num" w:pos="720"/>
+        </w:tabs>
+        <w:ind w:left="720" w:hanging="360"/>
+      </w:pPr>
+      <w:rPr>
+        <w:rFonts w:ascii="Symbol" w:hAnsi="Symbol" w:hint="default"/>
+        <w:sz w:val="20"/>
+      </w:rPr>
+    </w:lvl>
+    <w:lvl w:ilvl="1" w:tentative="1">
+      <w:start w:val="1"/>
+      <w:numFmt w:val="bullet"/>
+      <w:lvlText w:val="o"/>
+      <w:lvlJc w:val="left"/>
+      <w:pPr>
+        <w:tabs>
+          <w:tab w:val="num" w:pos="1440"/>
+        </w:tabs>
+        <w:ind w:left="1440" w:hanging="360"/>
+      </w:pPr>
+      <w:rPr>
+        <w:rFonts w:ascii="Courier New" w:hAnsi="Courier New" w:hint="default"/>
+        <w:sz w:val="20"/>
+      </w:rPr>
+    </w:lvl>
+    <w:lvl w:ilvl="2" w:tentative="1">
+      <w:start w:val="1"/>
+      <w:numFmt w:val="bullet"/>
+      <w:lvlText w:val=""/>
+      <w:lvlJc w:val="left"/>
+      <w:pPr>
+        <w:tabs>
+          <w:tab w:val="num" w:pos="2160"/>
+        </w:tabs>
+        <w:ind w:left="2160" w:hanging="360"/>
+      </w:pPr>
+      <w:rPr>
+        <w:rFonts w:ascii="Wingdings" w:hAnsi="Wingdings" w:hint="default"/>
+        <w:sz w:val="20"/>
+      </w:rPr>
+    </w:lvl>
+    <w:lvl w:ilvl="3" w:tentative="1">
+      <w:start w:val="1"/>
+      <w:numFmt w:val="bullet"/>
+      <w:lvlText w:val=""/>
+      <w:lvlJc w:val="left"/>
+      <w:pPr>
+        <w:tabs>
+          <w:tab w:val="num" w:pos="2880"/>
+        </w:tabs>
+        <w:ind w:left="2880" w:hanging="360"/>
+      </w:pPr>
+      <w:rPr>
+        <w:rFonts w:ascii="Wingdings" w:hAnsi="Wingdings" w:hint="default"/>
+        <w:sz w:val="20"/>
+      </w:rPr>
+    </w:lvl>
+    <w:lvl w:ilvl="4" w:tentative="1">
+      <w:start w:val="1"/>
+      <w:numFmt w:val="bullet"/>
+      <w:lvlText w:val=""/>
+      <w:lvlJc w:val="left"/>
+      <w:pPr>
+        <w:tabs>
+          <w:tab w:val="num" w:pos="3600"/>
+        </w:tabs>
+        <w:ind w:left="3600" w:hanging="360"/>
+      </w:pPr>
+      <w:rPr>
+        <w:rFonts w:ascii="Wingdings" w:hAnsi="Wingdings" w:hint="default"/>
+        <w:sz w:val="20"/>
+      </w:rPr>
+    </w:lvl>
+    <w:lvl w:ilvl="5" w:tentative="1">
+      <w:start w:val="1"/>
+      <w:numFmt w:val="bullet"/>
+      <w:lvlText w:val=""/>
+      <w:lvlJc w:val="left"/>
+      <w:pPr>
+        <w:tabs>
+          <w:tab w:val="num" w:pos="4320"/>
+        </w:tabs>
+        <w:ind w:left="4320" w:hanging="360"/>
+      </w:pPr>
+      <w:rPr>
+        <w:rFonts w:ascii="Wingdings" w:hAnsi="Wingdings" w:hint="default"/>
+        <w:sz w:val="20"/>
+      </w:rPr>
+    </w:lvl>
+    <w:lvl w:ilvl="6" w:tentative="1">
+      <w:start w:val="1"/>
+      <w:numFmt w:val="bullet"/>
+      <w:lvlText w:val=""/>
+      <w:lvlJc w:val="left"/>
+      <w:pPr>
+        <w:tabs>
+          <w:tab w:val="num" w:pos="5040"/>
+        </w:tabs>
+        <w:ind w:left="5040" w:hanging="360"/>
+      </w:pPr>
+      <w:rPr>
+        <w:rFonts w:ascii="Wingdings" w:hAnsi="Wingdings" w:hint="default"/>
+        <w:sz w:val="20"/>
+      </w:rPr>
+    </w:lvl>
+    <w:lvl w:ilvl="7" w:tentative="1">
+      <w:start w:val="1"/>
+      <w:numFmt w:val="bullet"/>
+      <w:lvlText w:val=""/>
+      <w:lvlJc w:val="left"/>
+      <w:pPr>
+        <w:tabs>
+          <w:tab w:val="num" w:pos="5760"/>
+        </w:tabs>
+        <w:ind w:left="5760" w:hanging="360"/>
+      </w:pPr>
+      <w:rPr>
+        <w:rFonts w:ascii="Wingdings" w:hAnsi="Wingdings" w:hint="default"/>
+        <w:sz w:val="20"/>
+      </w:rPr>
+    </w:lvl>
+    <w:lvl w:ilvl="8" w:tentative="1">
+      <w:start w:val="1"/>
+      <w:numFmt w:val="bullet"/>
+      <w:lvlText w:val=""/>
+      <w:lvlJc w:val="left"/>
+      <w:pPr>
+        <w:tabs>
+          <w:tab w:val="num" w:pos="6480"/>
+        </w:tabs>
+        <w:ind w:left="6480" w:hanging="360"/>
+      </w:pPr>
+      <w:rPr>
+        <w:rFonts w:ascii="Wingdings" w:hAnsi="Wingdings" w:hint="default"/>
+        <w:sz w:val="20"/>
+      </w:rPr>
+    </w:lvl>
+  </w:abstractNum>
+  <w:abstractNum w:abstractNumId="15" w15:restartNumberingAfterBreak="0">
+    <w:nsid w:val="2FEA5D0B"/>
+    <w:multiLevelType w:val="multilevel"/>
+    <w:tmpl w:val="6BF2B0F8"/>
+    <w:lvl w:ilvl="0">
+      <w:start w:val="1"/>
+      <w:numFmt w:val="bullet"/>
+      <w:lvlText w:val=""/>
+      <w:lvlJc w:val="left"/>
+      <w:pPr>
+        <w:tabs>
+          <w:tab w:val="num" w:pos="720"/>
+        </w:tabs>
+        <w:ind w:left="720" w:hanging="360"/>
+      </w:pPr>
+      <w:rPr>
+        <w:rFonts w:ascii="Symbol" w:hAnsi="Symbol" w:hint="default"/>
+        <w:sz w:val="20"/>
+      </w:rPr>
+    </w:lvl>
+    <w:lvl w:ilvl="1" w:tentative="1">
+      <w:start w:val="1"/>
+      <w:numFmt w:val="bullet"/>
+      <w:lvlText w:val="o"/>
+      <w:lvlJc w:val="left"/>
+      <w:pPr>
+        <w:tabs>
+          <w:tab w:val="num" w:pos="1440"/>
+        </w:tabs>
+        <w:ind w:left="1440" w:hanging="360"/>
+      </w:pPr>
+      <w:rPr>
+        <w:rFonts w:ascii="Courier New" w:hAnsi="Courier New" w:hint="default"/>
+        <w:sz w:val="20"/>
+      </w:rPr>
+    </w:lvl>
+    <w:lvl w:ilvl="2" w:tentative="1">
+      <w:start w:val="1"/>
+      <w:numFmt w:val="bullet"/>
+      <w:lvlText w:val=""/>
+      <w:lvlJc w:val="left"/>
+      <w:pPr>
+        <w:tabs>
+          <w:tab w:val="num" w:pos="2160"/>
+        </w:tabs>
+        <w:ind w:left="2160" w:hanging="360"/>
+      </w:pPr>
+      <w:rPr>
+        <w:rFonts w:ascii="Wingdings" w:hAnsi="Wingdings" w:hint="default"/>
+        <w:sz w:val="20"/>
+      </w:rPr>
+    </w:lvl>
+    <w:lvl w:ilvl="3" w:tentative="1">
+      <w:start w:val="1"/>
+      <w:numFmt w:val="bullet"/>
+      <w:lvlText w:val=""/>
+      <w:lvlJc w:val="left"/>
+      <w:pPr>
+        <w:tabs>
+          <w:tab w:val="num" w:pos="2880"/>
+        </w:tabs>
+        <w:ind w:left="2880" w:hanging="360"/>
+      </w:pPr>
+      <w:rPr>
+        <w:rFonts w:ascii="Wingdings" w:hAnsi="Wingdings" w:hint="default"/>
+        <w:sz w:val="20"/>
+      </w:rPr>
+    </w:lvl>
+    <w:lvl w:ilvl="4" w:tentative="1">
+      <w:start w:val="1"/>
+      <w:numFmt w:val="bullet"/>
+      <w:lvlText w:val=""/>
+      <w:lvlJc w:val="left"/>
+      <w:pPr>
+        <w:tabs>
+          <w:tab w:val="num" w:pos="3600"/>
+        </w:tabs>
+        <w:ind w:left="3600" w:hanging="360"/>
+      </w:pPr>
+      <w:rPr>
+        <w:rFonts w:ascii="Wingdings" w:hAnsi="Wingdings" w:hint="default"/>
+        <w:sz w:val="20"/>
+      </w:rPr>
+    </w:lvl>
+    <w:lvl w:ilvl="5" w:tentative="1">
+      <w:start w:val="1"/>
+      <w:numFmt w:val="bullet"/>
+      <w:lvlText w:val=""/>
+      <w:lvlJc w:val="left"/>
+      <w:pPr>
+        <w:tabs>
+          <w:tab w:val="num" w:pos="4320"/>
+        </w:tabs>
+        <w:ind w:left="4320" w:hanging="360"/>
+      </w:pPr>
+      <w:rPr>
+        <w:rFonts w:ascii="Wingdings" w:hAnsi="Wingdings" w:hint="default"/>
+        <w:sz w:val="20"/>
+      </w:rPr>
+    </w:lvl>
+    <w:lvl w:ilvl="6" w:tentative="1">
+      <w:start w:val="1"/>
+      <w:numFmt w:val="bullet"/>
+      <w:lvlText w:val=""/>
+      <w:lvlJc w:val="left"/>
+      <w:pPr>
+        <w:tabs>
+          <w:tab w:val="num" w:pos="5040"/>
+        </w:tabs>
+        <w:ind w:left="5040" w:hanging="360"/>
+      </w:pPr>
+      <w:rPr>
+        <w:rFonts w:ascii="Wingdings" w:hAnsi="Wingdings" w:hint="default"/>
+        <w:sz w:val="20"/>
+      </w:rPr>
+    </w:lvl>
+    <w:lvl w:ilvl="7" w:tentative="1">
+      <w:start w:val="1"/>
+      <w:numFmt w:val="bullet"/>
+      <w:lvlText w:val=""/>
+      <w:lvlJc w:val="left"/>
+      <w:pPr>
+        <w:tabs>
+          <w:tab w:val="num" w:pos="5760"/>
+        </w:tabs>
+        <w:ind w:left="5760" w:hanging="360"/>
+      </w:pPr>
+      <w:rPr>
+        <w:rFonts w:ascii="Wingdings" w:hAnsi="Wingdings" w:hint="default"/>
+        <w:sz w:val="20"/>
+      </w:rPr>
+    </w:lvl>
+    <w:lvl w:ilvl="8" w:tentative="1">
+      <w:start w:val="1"/>
+      <w:numFmt w:val="bullet"/>
+      <w:lvlText w:val=""/>
+      <w:lvlJc w:val="left"/>
+      <w:pPr>
+        <w:tabs>
+          <w:tab w:val="num" w:pos="6480"/>
+        </w:tabs>
+        <w:ind w:left="6480" w:hanging="360"/>
+      </w:pPr>
+      <w:rPr>
+        <w:rFonts w:ascii="Wingdings" w:hAnsi="Wingdings" w:hint="default"/>
+        <w:sz w:val="20"/>
+      </w:rPr>
+    </w:lvl>
+  </w:abstractNum>
+  <w:abstractNum w:abstractNumId="16" w15:restartNumberingAfterBreak="0">
+    <w:nsid w:val="34445700"/>
+    <w:multiLevelType w:val="multilevel"/>
+    <w:tmpl w:val="E0604950"/>
+    <w:lvl w:ilvl="0">
+      <w:start w:val="1"/>
+      <w:numFmt w:val="bullet"/>
+      <w:lvlText w:val=""/>
+      <w:lvlJc w:val="left"/>
+      <w:pPr>
+        <w:tabs>
+          <w:tab w:val="num" w:pos="720"/>
+        </w:tabs>
+        <w:ind w:left="720" w:hanging="360"/>
+      </w:pPr>
+      <w:rPr>
+        <w:rFonts w:ascii="Symbol" w:hAnsi="Symbol" w:hint="default"/>
+        <w:sz w:val="20"/>
+      </w:rPr>
+    </w:lvl>
+    <w:lvl w:ilvl="1">
+      <w:start w:val="1"/>
+      <w:numFmt w:val="bullet"/>
+      <w:lvlText w:val="o"/>
+      <w:lvlJc w:val="left"/>
+      <w:pPr>
+        <w:tabs>
+          <w:tab w:val="num" w:pos="1440"/>
+        </w:tabs>
+        <w:ind w:left="1440" w:hanging="360"/>
+      </w:pPr>
+      <w:rPr>
+        <w:rFonts w:ascii="Courier New" w:hAnsi="Courier New" w:hint="default"/>
+        <w:sz w:val="20"/>
+      </w:rPr>
+    </w:lvl>
+    <w:lvl w:ilvl="2" w:tentative="1">
+      <w:start w:val="1"/>
+      <w:numFmt w:val="bullet"/>
+      <w:lvlText w:val=""/>
+      <w:lvlJc w:val="left"/>
+      <w:pPr>
+        <w:tabs>
+          <w:tab w:val="num" w:pos="2160"/>
+        </w:tabs>
+        <w:ind w:left="2160" w:hanging="360"/>
+      </w:pPr>
+      <w:rPr>
+        <w:rFonts w:ascii="Wingdings" w:hAnsi="Wingdings" w:hint="default"/>
+        <w:sz w:val="20"/>
+      </w:rPr>
+    </w:lvl>
+    <w:lvl w:ilvl="3" w:tentative="1">
+      <w:start w:val="1"/>
+      <w:numFmt w:val="bullet"/>
+      <w:lvlText w:val=""/>
+      <w:lvlJc w:val="left"/>
+      <w:pPr>
+        <w:tabs>
+          <w:tab w:val="num" w:pos="2880"/>
+        </w:tabs>
+        <w:ind w:left="2880" w:hanging="360"/>
+      </w:pPr>
+      <w:rPr>
+        <w:rFonts w:ascii="Wingdings" w:hAnsi="Wingdings" w:hint="default"/>
+        <w:sz w:val="20"/>
+      </w:rPr>
+    </w:lvl>
+    <w:lvl w:ilvl="4" w:tentative="1">
+      <w:start w:val="1"/>
+      <w:numFmt w:val="bullet"/>
+      <w:lvlText w:val=""/>
+      <w:lvlJc w:val="left"/>
+      <w:pPr>
+        <w:tabs>
+          <w:tab w:val="num" w:pos="3600"/>
+        </w:tabs>
+        <w:ind w:left="3600" w:hanging="360"/>
+      </w:pPr>
+      <w:rPr>
+        <w:rFonts w:ascii="Wingdings" w:hAnsi="Wingdings" w:hint="default"/>
+        <w:sz w:val="20"/>
+      </w:rPr>
+    </w:lvl>
+    <w:lvl w:ilvl="5" w:tentative="1">
+      <w:start w:val="1"/>
+      <w:numFmt w:val="bullet"/>
+      <w:lvlText w:val=""/>
+      <w:lvlJc w:val="left"/>
+      <w:pPr>
+        <w:tabs>
+          <w:tab w:val="num" w:pos="4320"/>
+        </w:tabs>
+        <w:ind w:left="4320" w:hanging="360"/>
+      </w:pPr>
+      <w:rPr>
+        <w:rFonts w:ascii="Wingdings" w:hAnsi="Wingdings" w:hint="default"/>
+        <w:sz w:val="20"/>
+      </w:rPr>
+    </w:lvl>
+    <w:lvl w:ilvl="6" w:tentative="1">
+      <w:start w:val="1"/>
+      <w:numFmt w:val="bullet"/>
+      <w:lvlText w:val=""/>
+      <w:lvlJc w:val="left"/>
+      <w:pPr>
+        <w:tabs>
+          <w:tab w:val="num" w:pos="5040"/>
+        </w:tabs>
+        <w:ind w:left="5040" w:hanging="360"/>
+      </w:pPr>
+      <w:rPr>
+        <w:rFonts w:ascii="Wingdings" w:hAnsi="Wingdings" w:hint="default"/>
+        <w:sz w:val="20"/>
+      </w:rPr>
+    </w:lvl>
+    <w:lvl w:ilvl="7" w:tentative="1">
+      <w:start w:val="1"/>
+      <w:numFmt w:val="bullet"/>
+      <w:lvlText w:val=""/>
+      <w:lvlJc w:val="left"/>
+      <w:pPr>
+        <w:tabs>
+          <w:tab w:val="num" w:pos="5760"/>
+        </w:tabs>
+        <w:ind w:left="5760" w:hanging="360"/>
+      </w:pPr>
+      <w:rPr>
+        <w:rFonts w:ascii="Wingdings" w:hAnsi="Wingdings" w:hint="default"/>
+        <w:sz w:val="20"/>
+      </w:rPr>
+    </w:lvl>
+    <w:lvl w:ilvl="8" w:tentative="1">
+      <w:start w:val="1"/>
+      <w:numFmt w:val="bullet"/>
+      <w:lvlText w:val=""/>
+      <w:lvlJc w:val="left"/>
+      <w:pPr>
+        <w:tabs>
+          <w:tab w:val="num" w:pos="6480"/>
+        </w:tabs>
+        <w:ind w:left="6480" w:hanging="360"/>
+      </w:pPr>
+      <w:rPr>
+        <w:rFonts w:ascii="Wingdings" w:hAnsi="Wingdings" w:hint="default"/>
+        <w:sz w:val="20"/>
+      </w:rPr>
+    </w:lvl>
+  </w:abstractNum>
+  <w:abstractNum w:abstractNumId="17" w15:restartNumberingAfterBreak="0">
     <w:nsid w:val="34C110F3"/>
     <w:multiLevelType w:val="multilevel"/>
     <w:tmpl w:val="C0BC73FA"/>
@@ -7098,7 +10229,7 @@
       </w:rPr>
     </w:lvl>
   </w:abstractNum>
-  <w:abstractNum w:abstractNumId="9" w15:restartNumberingAfterBreak="0">
+  <w:abstractNum w:abstractNumId="18" w15:restartNumberingAfterBreak="0">
     <w:nsid w:val="3A16143A"/>
     <w:multiLevelType w:val="multilevel"/>
     <w:tmpl w:val="56B02F12"/>
@@ -7247,7 +10378,7 @@
       </w:rPr>
     </w:lvl>
   </w:abstractNum>
-  <w:abstractNum w:abstractNumId="10" w15:restartNumberingAfterBreak="0">
+  <w:abstractNum w:abstractNumId="19" w15:restartNumberingAfterBreak="0">
     <w:nsid w:val="3E225A04"/>
     <w:multiLevelType w:val="multilevel"/>
     <w:tmpl w:val="1564FBAC"/>
@@ -7396,7 +10527,7 @@
       </w:rPr>
     </w:lvl>
   </w:abstractNum>
-  <w:abstractNum w:abstractNumId="11" w15:restartNumberingAfterBreak="0">
+  <w:abstractNum w:abstractNumId="20" w15:restartNumberingAfterBreak="0">
     <w:nsid w:val="403E44CE"/>
     <w:multiLevelType w:val="multilevel"/>
     <w:tmpl w:val="D062BB48"/>
@@ -7513,7 +10644,156 @@
       </w:pPr>
     </w:lvl>
   </w:abstractNum>
-  <w:abstractNum w:abstractNumId="12" w15:restartNumberingAfterBreak="0">
+  <w:abstractNum w:abstractNumId="21" w15:restartNumberingAfterBreak="0">
+    <w:nsid w:val="419B2A2E"/>
+    <w:multiLevelType w:val="multilevel"/>
+    <w:tmpl w:val="A6D0F08E"/>
+    <w:lvl w:ilvl="0">
+      <w:start w:val="1"/>
+      <w:numFmt w:val="bullet"/>
+      <w:lvlText w:val=""/>
+      <w:lvlJc w:val="left"/>
+      <w:pPr>
+        <w:tabs>
+          <w:tab w:val="num" w:pos="720"/>
+        </w:tabs>
+        <w:ind w:left="720" w:hanging="360"/>
+      </w:pPr>
+      <w:rPr>
+        <w:rFonts w:ascii="Symbol" w:hAnsi="Symbol" w:hint="default"/>
+        <w:sz w:val="20"/>
+      </w:rPr>
+    </w:lvl>
+    <w:lvl w:ilvl="1" w:tentative="1">
+      <w:start w:val="1"/>
+      <w:numFmt w:val="bullet"/>
+      <w:lvlText w:val="o"/>
+      <w:lvlJc w:val="left"/>
+      <w:pPr>
+        <w:tabs>
+          <w:tab w:val="num" w:pos="1440"/>
+        </w:tabs>
+        <w:ind w:left="1440" w:hanging="360"/>
+      </w:pPr>
+      <w:rPr>
+        <w:rFonts w:ascii="Courier New" w:hAnsi="Courier New" w:hint="default"/>
+        <w:sz w:val="20"/>
+      </w:rPr>
+    </w:lvl>
+    <w:lvl w:ilvl="2" w:tentative="1">
+      <w:start w:val="1"/>
+      <w:numFmt w:val="bullet"/>
+      <w:lvlText w:val=""/>
+      <w:lvlJc w:val="left"/>
+      <w:pPr>
+        <w:tabs>
+          <w:tab w:val="num" w:pos="2160"/>
+        </w:tabs>
+        <w:ind w:left="2160" w:hanging="360"/>
+      </w:pPr>
+      <w:rPr>
+        <w:rFonts w:ascii="Wingdings" w:hAnsi="Wingdings" w:hint="default"/>
+        <w:sz w:val="20"/>
+      </w:rPr>
+    </w:lvl>
+    <w:lvl w:ilvl="3" w:tentative="1">
+      <w:start w:val="1"/>
+      <w:numFmt w:val="bullet"/>
+      <w:lvlText w:val=""/>
+      <w:lvlJc w:val="left"/>
+      <w:pPr>
+        <w:tabs>
+          <w:tab w:val="num" w:pos="2880"/>
+        </w:tabs>
+        <w:ind w:left="2880" w:hanging="360"/>
+      </w:pPr>
+      <w:rPr>
+        <w:rFonts w:ascii="Wingdings" w:hAnsi="Wingdings" w:hint="default"/>
+        <w:sz w:val="20"/>
+      </w:rPr>
+    </w:lvl>
+    <w:lvl w:ilvl="4" w:tentative="1">
+      <w:start w:val="1"/>
+      <w:numFmt w:val="bullet"/>
+      <w:lvlText w:val=""/>
+      <w:lvlJc w:val="left"/>
+      <w:pPr>
+        <w:tabs>
+          <w:tab w:val="num" w:pos="3600"/>
+        </w:tabs>
+        <w:ind w:left="3600" w:hanging="360"/>
+      </w:pPr>
+      <w:rPr>
+        <w:rFonts w:ascii="Wingdings" w:hAnsi="Wingdings" w:hint="default"/>
+        <w:sz w:val="20"/>
+      </w:rPr>
+    </w:lvl>
+    <w:lvl w:ilvl="5" w:tentative="1">
+      <w:start w:val="1"/>
+      <w:numFmt w:val="bullet"/>
+      <w:lvlText w:val=""/>
+      <w:lvlJc w:val="left"/>
+      <w:pPr>
+        <w:tabs>
+          <w:tab w:val="num" w:pos="4320"/>
+        </w:tabs>
+        <w:ind w:left="4320" w:hanging="360"/>
+      </w:pPr>
+      <w:rPr>
+        <w:rFonts w:ascii="Wingdings" w:hAnsi="Wingdings" w:hint="default"/>
+        <w:sz w:val="20"/>
+      </w:rPr>
+    </w:lvl>
+    <w:lvl w:ilvl="6" w:tentative="1">
+      <w:start w:val="1"/>
+      <w:numFmt w:val="bullet"/>
+      <w:lvlText w:val=""/>
+      <w:lvlJc w:val="left"/>
+      <w:pPr>
+        <w:tabs>
+          <w:tab w:val="num" w:pos="5040"/>
+        </w:tabs>
+        <w:ind w:left="5040" w:hanging="360"/>
+      </w:pPr>
+      <w:rPr>
+        <w:rFonts w:ascii="Wingdings" w:hAnsi="Wingdings" w:hint="default"/>
+        <w:sz w:val="20"/>
+      </w:rPr>
+    </w:lvl>
+    <w:lvl w:ilvl="7" w:tentative="1">
+      <w:start w:val="1"/>
+      <w:numFmt w:val="bullet"/>
+      <w:lvlText w:val=""/>
+      <w:lvlJc w:val="left"/>
+      <w:pPr>
+        <w:tabs>
+          <w:tab w:val="num" w:pos="5760"/>
+        </w:tabs>
+        <w:ind w:left="5760" w:hanging="360"/>
+      </w:pPr>
+      <w:rPr>
+        <w:rFonts w:ascii="Wingdings" w:hAnsi="Wingdings" w:hint="default"/>
+        <w:sz w:val="20"/>
+      </w:rPr>
+    </w:lvl>
+    <w:lvl w:ilvl="8" w:tentative="1">
+      <w:start w:val="1"/>
+      <w:numFmt w:val="bullet"/>
+      <w:lvlText w:val=""/>
+      <w:lvlJc w:val="left"/>
+      <w:pPr>
+        <w:tabs>
+          <w:tab w:val="num" w:pos="6480"/>
+        </w:tabs>
+        <w:ind w:left="6480" w:hanging="360"/>
+      </w:pPr>
+      <w:rPr>
+        <w:rFonts w:ascii="Wingdings" w:hAnsi="Wingdings" w:hint="default"/>
+        <w:sz w:val="20"/>
+      </w:rPr>
+    </w:lvl>
+  </w:abstractNum>
+  <w:abstractNum w:abstractNumId="22" w15:restartNumberingAfterBreak="0">
     <w:nsid w:val="41DA7EB3"/>
     <w:multiLevelType w:val="multilevel"/>
     <w:tmpl w:val="C960E18A"/>
@@ -7626,7 +10906,156 @@
       </w:pPr>
     </w:lvl>
   </w:abstractNum>
-  <w:abstractNum w:abstractNumId="13" w15:restartNumberingAfterBreak="0">
+  <w:abstractNum w:abstractNumId="23" w15:restartNumberingAfterBreak="0">
+    <w:nsid w:val="452F699E"/>
+    <w:multiLevelType w:val="multilevel"/>
+    <w:tmpl w:val="5FF6E568"/>
+    <w:lvl w:ilvl="0">
+      <w:start w:val="1"/>
+      <w:numFmt w:val="bullet"/>
+      <w:lvlText w:val=""/>
+      <w:lvlJc w:val="left"/>
+      <w:pPr>
+        <w:tabs>
+          <w:tab w:val="num" w:pos="720"/>
+        </w:tabs>
+        <w:ind w:left="720" w:hanging="360"/>
+      </w:pPr>
+      <w:rPr>
+        <w:rFonts w:ascii="Symbol" w:hAnsi="Symbol" w:hint="default"/>
+        <w:sz w:val="20"/>
+      </w:rPr>
+    </w:lvl>
+    <w:lvl w:ilvl="1">
+      <w:start w:val="1"/>
+      <w:numFmt w:val="bullet"/>
+      <w:lvlText w:val="o"/>
+      <w:lvlJc w:val="left"/>
+      <w:pPr>
+        <w:tabs>
+          <w:tab w:val="num" w:pos="1440"/>
+        </w:tabs>
+        <w:ind w:left="1440" w:hanging="360"/>
+      </w:pPr>
+      <w:rPr>
+        <w:rFonts w:ascii="Courier New" w:hAnsi="Courier New" w:hint="default"/>
+        <w:sz w:val="20"/>
+      </w:rPr>
+    </w:lvl>
+    <w:lvl w:ilvl="2" w:tentative="1">
+      <w:start w:val="1"/>
+      <w:numFmt w:val="bullet"/>
+      <w:lvlText w:val=""/>
+      <w:lvlJc w:val="left"/>
+      <w:pPr>
+        <w:tabs>
+          <w:tab w:val="num" w:pos="2160"/>
+        </w:tabs>
+        <w:ind w:left="2160" w:hanging="360"/>
+      </w:pPr>
+      <w:rPr>
+        <w:rFonts w:ascii="Wingdings" w:hAnsi="Wingdings" w:hint="default"/>
+        <w:sz w:val="20"/>
+      </w:rPr>
+    </w:lvl>
+    <w:lvl w:ilvl="3" w:tentative="1">
+      <w:start w:val="1"/>
+      <w:numFmt w:val="bullet"/>
+      <w:lvlText w:val=""/>
+      <w:lvlJc w:val="left"/>
+      <w:pPr>
+        <w:tabs>
+          <w:tab w:val="num" w:pos="2880"/>
+        </w:tabs>
+        <w:ind w:left="2880" w:hanging="360"/>
+      </w:pPr>
+      <w:rPr>
+        <w:rFonts w:ascii="Wingdings" w:hAnsi="Wingdings" w:hint="default"/>
+        <w:sz w:val="20"/>
+      </w:rPr>
+    </w:lvl>
+    <w:lvl w:ilvl="4" w:tentative="1">
+      <w:start w:val="1"/>
+      <w:numFmt w:val="bullet"/>
+      <w:lvlText w:val=""/>
+      <w:lvlJc w:val="left"/>
+      <w:pPr>
+        <w:tabs>
+          <w:tab w:val="num" w:pos="3600"/>
+        </w:tabs>
+        <w:ind w:left="3600" w:hanging="360"/>
+      </w:pPr>
+      <w:rPr>
+        <w:rFonts w:ascii="Wingdings" w:hAnsi="Wingdings" w:hint="default"/>
+        <w:sz w:val="20"/>
+      </w:rPr>
+    </w:lvl>
+    <w:lvl w:ilvl="5" w:tentative="1">
+      <w:start w:val="1"/>
+      <w:numFmt w:val="bullet"/>
+      <w:lvlText w:val=""/>
+      <w:lvlJc w:val="left"/>
+      <w:pPr>
+        <w:tabs>
+          <w:tab w:val="num" w:pos="4320"/>
+        </w:tabs>
+        <w:ind w:left="4320" w:hanging="360"/>
+      </w:pPr>
+      <w:rPr>
+        <w:rFonts w:ascii="Wingdings" w:hAnsi="Wingdings" w:hint="default"/>
+        <w:sz w:val="20"/>
+      </w:rPr>
+    </w:lvl>
+    <w:lvl w:ilvl="6" w:tentative="1">
+      <w:start w:val="1"/>
+      <w:numFmt w:val="bullet"/>
+      <w:lvlText w:val=""/>
+      <w:lvlJc w:val="left"/>
+      <w:pPr>
+        <w:tabs>
+          <w:tab w:val="num" w:pos="5040"/>
+        </w:tabs>
+        <w:ind w:left="5040" w:hanging="360"/>
+      </w:pPr>
+      <w:rPr>
+        <w:rFonts w:ascii="Wingdings" w:hAnsi="Wingdings" w:hint="default"/>
+        <w:sz w:val="20"/>
+      </w:rPr>
+    </w:lvl>
+    <w:lvl w:ilvl="7" w:tentative="1">
+      <w:start w:val="1"/>
+      <w:numFmt w:val="bullet"/>
+      <w:lvlText w:val=""/>
+      <w:lvlJc w:val="left"/>
+      <w:pPr>
+        <w:tabs>
+          <w:tab w:val="num" w:pos="5760"/>
+        </w:tabs>
+        <w:ind w:left="5760" w:hanging="360"/>
+      </w:pPr>
+      <w:rPr>
+        <w:rFonts w:ascii="Wingdings" w:hAnsi="Wingdings" w:hint="default"/>
+        <w:sz w:val="20"/>
+      </w:rPr>
+    </w:lvl>
+    <w:lvl w:ilvl="8" w:tentative="1">
+      <w:start w:val="1"/>
+      <w:numFmt w:val="bullet"/>
+      <w:lvlText w:val=""/>
+      <w:lvlJc w:val="left"/>
+      <w:pPr>
+        <w:tabs>
+          <w:tab w:val="num" w:pos="6480"/>
+        </w:tabs>
+        <w:ind w:left="6480" w:hanging="360"/>
+      </w:pPr>
+      <w:rPr>
+        <w:rFonts w:ascii="Wingdings" w:hAnsi="Wingdings" w:hint="default"/>
+        <w:sz w:val="20"/>
+      </w:rPr>
+    </w:lvl>
+  </w:abstractNum>
+  <w:abstractNum w:abstractNumId="24" w15:restartNumberingAfterBreak="0">
     <w:nsid w:val="482D1CD0"/>
     <w:multiLevelType w:val="multilevel"/>
     <w:tmpl w:val="1664549E"/>
@@ -7775,7 +11204,7 @@
       </w:rPr>
     </w:lvl>
   </w:abstractNum>
-  <w:abstractNum w:abstractNumId="14" w15:restartNumberingAfterBreak="0">
+  <w:abstractNum w:abstractNumId="25" w15:restartNumberingAfterBreak="0">
     <w:nsid w:val="484A7746"/>
     <w:multiLevelType w:val="multilevel"/>
     <w:tmpl w:val="28A23484"/>
@@ -7888,7 +11317,156 @@
       </w:pPr>
     </w:lvl>
   </w:abstractNum>
-  <w:abstractNum w:abstractNumId="15" w15:restartNumberingAfterBreak="0">
+  <w:abstractNum w:abstractNumId="26" w15:restartNumberingAfterBreak="0">
+    <w:nsid w:val="4AFB43B9"/>
+    <w:multiLevelType w:val="multilevel"/>
+    <w:tmpl w:val="936048AA"/>
+    <w:lvl w:ilvl="0">
+      <w:start w:val="1"/>
+      <w:numFmt w:val="bullet"/>
+      <w:lvlText w:val=""/>
+      <w:lvlJc w:val="left"/>
+      <w:pPr>
+        <w:tabs>
+          <w:tab w:val="num" w:pos="720"/>
+        </w:tabs>
+        <w:ind w:left="720" w:hanging="360"/>
+      </w:pPr>
+      <w:rPr>
+        <w:rFonts w:ascii="Symbol" w:hAnsi="Symbol" w:hint="default"/>
+        <w:sz w:val="20"/>
+      </w:rPr>
+    </w:lvl>
+    <w:lvl w:ilvl="1">
+      <w:start w:val="1"/>
+      <w:numFmt w:val="bullet"/>
+      <w:lvlText w:val="o"/>
+      <w:lvlJc w:val="left"/>
+      <w:pPr>
+        <w:tabs>
+          <w:tab w:val="num" w:pos="1440"/>
+        </w:tabs>
+        <w:ind w:left="1440" w:hanging="360"/>
+      </w:pPr>
+      <w:rPr>
+        <w:rFonts w:ascii="Courier New" w:hAnsi="Courier New" w:hint="default"/>
+        <w:sz w:val="20"/>
+      </w:rPr>
+    </w:lvl>
+    <w:lvl w:ilvl="2" w:tentative="1">
+      <w:start w:val="1"/>
+      <w:numFmt w:val="bullet"/>
+      <w:lvlText w:val=""/>
+      <w:lvlJc w:val="left"/>
+      <w:pPr>
+        <w:tabs>
+          <w:tab w:val="num" w:pos="2160"/>
+        </w:tabs>
+        <w:ind w:left="2160" w:hanging="360"/>
+      </w:pPr>
+      <w:rPr>
+        <w:rFonts w:ascii="Wingdings" w:hAnsi="Wingdings" w:hint="default"/>
+        <w:sz w:val="20"/>
+      </w:rPr>
+    </w:lvl>
+    <w:lvl w:ilvl="3" w:tentative="1">
+      <w:start w:val="1"/>
+      <w:numFmt w:val="bullet"/>
+      <w:lvlText w:val=""/>
+      <w:lvlJc w:val="left"/>
+      <w:pPr>
+        <w:tabs>
+          <w:tab w:val="num" w:pos="2880"/>
+        </w:tabs>
+        <w:ind w:left="2880" w:hanging="360"/>
+      </w:pPr>
+      <w:rPr>
+        <w:rFonts w:ascii="Wingdings" w:hAnsi="Wingdings" w:hint="default"/>
+        <w:sz w:val="20"/>
+      </w:rPr>
+    </w:lvl>
+    <w:lvl w:ilvl="4" w:tentative="1">
+      <w:start w:val="1"/>
+      <w:numFmt w:val="bullet"/>
+      <w:lvlText w:val=""/>
+      <w:lvlJc w:val="left"/>
+      <w:pPr>
+        <w:tabs>
+          <w:tab w:val="num" w:pos="3600"/>
+        </w:tabs>
+        <w:ind w:left="3600" w:hanging="360"/>
+      </w:pPr>
+      <w:rPr>
+        <w:rFonts w:ascii="Wingdings" w:hAnsi="Wingdings" w:hint="default"/>
+        <w:sz w:val="20"/>
+      </w:rPr>
+    </w:lvl>
+    <w:lvl w:ilvl="5" w:tentative="1">
+      <w:start w:val="1"/>
+      <w:numFmt w:val="bullet"/>
+      <w:lvlText w:val=""/>
+      <w:lvlJc w:val="left"/>
+      <w:pPr>
+        <w:tabs>
+          <w:tab w:val="num" w:pos="4320"/>
+        </w:tabs>
+        <w:ind w:left="4320" w:hanging="360"/>
+      </w:pPr>
+      <w:rPr>
+        <w:rFonts w:ascii="Wingdings" w:hAnsi="Wingdings" w:hint="default"/>
+        <w:sz w:val="20"/>
+      </w:rPr>
+    </w:lvl>
+    <w:lvl w:ilvl="6" w:tentative="1">
+      <w:start w:val="1"/>
+      <w:numFmt w:val="bullet"/>
+      <w:lvlText w:val=""/>
+      <w:lvlJc w:val="left"/>
+      <w:pPr>
+        <w:tabs>
+          <w:tab w:val="num" w:pos="5040"/>
+        </w:tabs>
+        <w:ind w:left="5040" w:hanging="360"/>
+      </w:pPr>
+      <w:rPr>
+        <w:rFonts w:ascii="Wingdings" w:hAnsi="Wingdings" w:hint="default"/>
+        <w:sz w:val="20"/>
+      </w:rPr>
+    </w:lvl>
+    <w:lvl w:ilvl="7" w:tentative="1">
+      <w:start w:val="1"/>
+      <w:numFmt w:val="bullet"/>
+      <w:lvlText w:val=""/>
+      <w:lvlJc w:val="left"/>
+      <w:pPr>
+        <w:tabs>
+          <w:tab w:val="num" w:pos="5760"/>
+        </w:tabs>
+        <w:ind w:left="5760" w:hanging="360"/>
+      </w:pPr>
+      <w:rPr>
+        <w:rFonts w:ascii="Wingdings" w:hAnsi="Wingdings" w:hint="default"/>
+        <w:sz w:val="20"/>
+      </w:rPr>
+    </w:lvl>
+    <w:lvl w:ilvl="8" w:tentative="1">
+      <w:start w:val="1"/>
+      <w:numFmt w:val="bullet"/>
+      <w:lvlText w:val=""/>
+      <w:lvlJc w:val="left"/>
+      <w:pPr>
+        <w:tabs>
+          <w:tab w:val="num" w:pos="6480"/>
+        </w:tabs>
+        <w:ind w:left="6480" w:hanging="360"/>
+      </w:pPr>
+      <w:rPr>
+        <w:rFonts w:ascii="Wingdings" w:hAnsi="Wingdings" w:hint="default"/>
+        <w:sz w:val="20"/>
+      </w:rPr>
+    </w:lvl>
+  </w:abstractNum>
+  <w:abstractNum w:abstractNumId="27" w15:restartNumberingAfterBreak="0">
     <w:nsid w:val="4C0E74D6"/>
     <w:multiLevelType w:val="multilevel"/>
     <w:tmpl w:val="278C8230"/>
@@ -8001,7 +11579,7 @@
       </w:pPr>
     </w:lvl>
   </w:abstractNum>
-  <w:abstractNum w:abstractNumId="16" w15:restartNumberingAfterBreak="0">
+  <w:abstractNum w:abstractNumId="28" w15:restartNumberingAfterBreak="0">
     <w:nsid w:val="510F79E2"/>
     <w:multiLevelType w:val="multilevel"/>
     <w:tmpl w:val="269EEF22"/>
@@ -8150,7 +11728,7 @@
       </w:rPr>
     </w:lvl>
   </w:abstractNum>
-  <w:abstractNum w:abstractNumId="17" w15:restartNumberingAfterBreak="0">
+  <w:abstractNum w:abstractNumId="29" w15:restartNumberingAfterBreak="0">
     <w:nsid w:val="516C5716"/>
     <w:multiLevelType w:val="multilevel"/>
     <w:tmpl w:val="7AF23470"/>
@@ -8299,7 +11877,7 @@
       </w:rPr>
     </w:lvl>
   </w:abstractNum>
-  <w:abstractNum w:abstractNumId="18" w15:restartNumberingAfterBreak="0">
+  <w:abstractNum w:abstractNumId="30" w15:restartNumberingAfterBreak="0">
     <w:nsid w:val="520B4018"/>
     <w:multiLevelType w:val="multilevel"/>
     <w:tmpl w:val="1326D7C2"/>
@@ -8448,7 +12026,7 @@
       </w:rPr>
     </w:lvl>
   </w:abstractNum>
-  <w:abstractNum w:abstractNumId="19" w15:restartNumberingAfterBreak="0">
+  <w:abstractNum w:abstractNumId="31" w15:restartNumberingAfterBreak="0">
     <w:nsid w:val="523576B7"/>
     <w:multiLevelType w:val="multilevel"/>
     <w:tmpl w:val="154E9E36"/>
@@ -8597,7 +12175,7 @@
       </w:rPr>
     </w:lvl>
   </w:abstractNum>
-  <w:abstractNum w:abstractNumId="20" w15:restartNumberingAfterBreak="0">
+  <w:abstractNum w:abstractNumId="32" w15:restartNumberingAfterBreak="0">
     <w:nsid w:val="530C408C"/>
     <w:multiLevelType w:val="multilevel"/>
     <w:tmpl w:val="F2707894"/>
@@ -8746,7 +12324,7 @@
       </w:rPr>
     </w:lvl>
   </w:abstractNum>
-  <w:abstractNum w:abstractNumId="21" w15:restartNumberingAfterBreak="0">
+  <w:abstractNum w:abstractNumId="33" w15:restartNumberingAfterBreak="0">
     <w:nsid w:val="5368013F"/>
     <w:multiLevelType w:val="multilevel"/>
     <w:tmpl w:val="F35EE82C"/>
@@ -8895,7 +12473,7 @@
       </w:rPr>
     </w:lvl>
   </w:abstractNum>
-  <w:abstractNum w:abstractNumId="22" w15:restartNumberingAfterBreak="0">
+  <w:abstractNum w:abstractNumId="34" w15:restartNumberingAfterBreak="0">
     <w:nsid w:val="57DA0CEE"/>
     <w:multiLevelType w:val="multilevel"/>
     <w:tmpl w:val="8D3CC42E"/>
@@ -9044,7 +12622,7 @@
       </w:rPr>
     </w:lvl>
   </w:abstractNum>
-  <w:abstractNum w:abstractNumId="23" w15:restartNumberingAfterBreak="0">
+  <w:abstractNum w:abstractNumId="35" w15:restartNumberingAfterBreak="0">
     <w:nsid w:val="61D27757"/>
     <w:multiLevelType w:val="multilevel"/>
     <w:tmpl w:val="40D0D0A4"/>
@@ -9161,7 +12739,7 @@
       </w:pPr>
     </w:lvl>
   </w:abstractNum>
-  <w:abstractNum w:abstractNumId="24" w15:restartNumberingAfterBreak="0">
+  <w:abstractNum w:abstractNumId="36" w15:restartNumberingAfterBreak="0">
     <w:nsid w:val="68E5646A"/>
     <w:multiLevelType w:val="multilevel"/>
     <w:tmpl w:val="1FEE6CE4"/>
@@ -9310,7 +12888,7 @@
       </w:rPr>
     </w:lvl>
   </w:abstractNum>
-  <w:abstractNum w:abstractNumId="25" w15:restartNumberingAfterBreak="0">
+  <w:abstractNum w:abstractNumId="37" w15:restartNumberingAfterBreak="0">
     <w:nsid w:val="6BAA2554"/>
     <w:multiLevelType w:val="multilevel"/>
     <w:tmpl w:val="8C787C32"/>
@@ -9459,7 +13037,7 @@
       </w:rPr>
     </w:lvl>
   </w:abstractNum>
-  <w:abstractNum w:abstractNumId="26" w15:restartNumberingAfterBreak="0">
+  <w:abstractNum w:abstractNumId="38" w15:restartNumberingAfterBreak="0">
     <w:nsid w:val="6D005831"/>
     <w:multiLevelType w:val="multilevel"/>
     <w:tmpl w:val="18DABB58"/>
@@ -9608,7 +13186,156 @@
       </w:rPr>
     </w:lvl>
   </w:abstractNum>
-  <w:abstractNum w:abstractNumId="27" w15:restartNumberingAfterBreak="0">
+  <w:abstractNum w:abstractNumId="39" w15:restartNumberingAfterBreak="0">
+    <w:nsid w:val="6D935D44"/>
+    <w:multiLevelType w:val="multilevel"/>
+    <w:tmpl w:val="625825F4"/>
+    <w:lvl w:ilvl="0">
+      <w:start w:val="1"/>
+      <w:numFmt w:val="bullet"/>
+      <w:lvlText w:val=""/>
+      <w:lvlJc w:val="left"/>
+      <w:pPr>
+        <w:tabs>
+          <w:tab w:val="num" w:pos="720"/>
+        </w:tabs>
+        <w:ind w:left="720" w:hanging="360"/>
+      </w:pPr>
+      <w:rPr>
+        <w:rFonts w:ascii="Symbol" w:hAnsi="Symbol" w:hint="default"/>
+        <w:sz w:val="20"/>
+      </w:rPr>
+    </w:lvl>
+    <w:lvl w:ilvl="1" w:tentative="1">
+      <w:start w:val="1"/>
+      <w:numFmt w:val="bullet"/>
+      <w:lvlText w:val="o"/>
+      <w:lvlJc w:val="left"/>
+      <w:pPr>
+        <w:tabs>
+          <w:tab w:val="num" w:pos="1440"/>
+        </w:tabs>
+        <w:ind w:left="1440" w:hanging="360"/>
+      </w:pPr>
+      <w:rPr>
+        <w:rFonts w:ascii="Courier New" w:hAnsi="Courier New" w:hint="default"/>
+        <w:sz w:val="20"/>
+      </w:rPr>
+    </w:lvl>
+    <w:lvl w:ilvl="2" w:tentative="1">
+      <w:start w:val="1"/>
+      <w:numFmt w:val="bullet"/>
+      <w:lvlText w:val=""/>
+      <w:lvlJc w:val="left"/>
+      <w:pPr>
+        <w:tabs>
+          <w:tab w:val="num" w:pos="2160"/>
+        </w:tabs>
+        <w:ind w:left="2160" w:hanging="360"/>
+      </w:pPr>
+      <w:rPr>
+        <w:rFonts w:ascii="Wingdings" w:hAnsi="Wingdings" w:hint="default"/>
+        <w:sz w:val="20"/>
+      </w:rPr>
+    </w:lvl>
+    <w:lvl w:ilvl="3" w:tentative="1">
+      <w:start w:val="1"/>
+      <w:numFmt w:val="bullet"/>
+      <w:lvlText w:val=""/>
+      <w:lvlJc w:val="left"/>
+      <w:pPr>
+        <w:tabs>
+          <w:tab w:val="num" w:pos="2880"/>
+        </w:tabs>
+        <w:ind w:left="2880" w:hanging="360"/>
+      </w:pPr>
+      <w:rPr>
+        <w:rFonts w:ascii="Wingdings" w:hAnsi="Wingdings" w:hint="default"/>
+        <w:sz w:val="20"/>
+      </w:rPr>
+    </w:lvl>
+    <w:lvl w:ilvl="4" w:tentative="1">
+      <w:start w:val="1"/>
+      <w:numFmt w:val="bullet"/>
+      <w:lvlText w:val=""/>
+      <w:lvlJc w:val="left"/>
+      <w:pPr>
+        <w:tabs>
+          <w:tab w:val="num" w:pos="3600"/>
+        </w:tabs>
+        <w:ind w:left="3600" w:hanging="360"/>
+      </w:pPr>
+      <w:rPr>
+        <w:rFonts w:ascii="Wingdings" w:hAnsi="Wingdings" w:hint="default"/>
+        <w:sz w:val="20"/>
+      </w:rPr>
+    </w:lvl>
+    <w:lvl w:ilvl="5" w:tentative="1">
+      <w:start w:val="1"/>
+      <w:numFmt w:val="bullet"/>
+      <w:lvlText w:val=""/>
+      <w:lvlJc w:val="left"/>
+      <w:pPr>
+        <w:tabs>
+          <w:tab w:val="num" w:pos="4320"/>
+        </w:tabs>
+        <w:ind w:left="4320" w:hanging="360"/>
+      </w:pPr>
+      <w:rPr>
+        <w:rFonts w:ascii="Wingdings" w:hAnsi="Wingdings" w:hint="default"/>
+        <w:sz w:val="20"/>
+      </w:rPr>
+    </w:lvl>
+    <w:lvl w:ilvl="6" w:tentative="1">
+      <w:start w:val="1"/>
+      <w:numFmt w:val="bullet"/>
+      <w:lvlText w:val=""/>
+      <w:lvlJc w:val="left"/>
+      <w:pPr>
+        <w:tabs>
+          <w:tab w:val="num" w:pos="5040"/>
+        </w:tabs>
+        <w:ind w:left="5040" w:hanging="360"/>
+      </w:pPr>
+      <w:rPr>
+        <w:rFonts w:ascii="Wingdings" w:hAnsi="Wingdings" w:hint="default"/>
+        <w:sz w:val="20"/>
+      </w:rPr>
+    </w:lvl>
+    <w:lvl w:ilvl="7" w:tentative="1">
+      <w:start w:val="1"/>
+      <w:numFmt w:val="bullet"/>
+      <w:lvlText w:val=""/>
+      <w:lvlJc w:val="left"/>
+      <w:pPr>
+        <w:tabs>
+          <w:tab w:val="num" w:pos="5760"/>
+        </w:tabs>
+        <w:ind w:left="5760" w:hanging="360"/>
+      </w:pPr>
+      <w:rPr>
+        <w:rFonts w:ascii="Wingdings" w:hAnsi="Wingdings" w:hint="default"/>
+        <w:sz w:val="20"/>
+      </w:rPr>
+    </w:lvl>
+    <w:lvl w:ilvl="8" w:tentative="1">
+      <w:start w:val="1"/>
+      <w:numFmt w:val="bullet"/>
+      <w:lvlText w:val=""/>
+      <w:lvlJc w:val="left"/>
+      <w:pPr>
+        <w:tabs>
+          <w:tab w:val="num" w:pos="6480"/>
+        </w:tabs>
+        <w:ind w:left="6480" w:hanging="360"/>
+      </w:pPr>
+      <w:rPr>
+        <w:rFonts w:ascii="Wingdings" w:hAnsi="Wingdings" w:hint="default"/>
+        <w:sz w:val="20"/>
+      </w:rPr>
+    </w:lvl>
+  </w:abstractNum>
+  <w:abstractNum w:abstractNumId="40" w15:restartNumberingAfterBreak="0">
     <w:nsid w:val="6F393A9B"/>
     <w:multiLevelType w:val="multilevel"/>
     <w:tmpl w:val="149E35E6"/>
@@ -9721,7 +13448,7 @@
       </w:pPr>
     </w:lvl>
   </w:abstractNum>
-  <w:abstractNum w:abstractNumId="28" w15:restartNumberingAfterBreak="0">
+  <w:abstractNum w:abstractNumId="41" w15:restartNumberingAfterBreak="0">
     <w:nsid w:val="7235224A"/>
     <w:multiLevelType w:val="multilevel"/>
     <w:tmpl w:val="5232DBC6"/>
@@ -9870,7 +13597,7 @@
       </w:rPr>
     </w:lvl>
   </w:abstractNum>
-  <w:abstractNum w:abstractNumId="29" w15:restartNumberingAfterBreak="0">
+  <w:abstractNum w:abstractNumId="42" w15:restartNumberingAfterBreak="0">
     <w:nsid w:val="726C601F"/>
     <w:multiLevelType w:val="multilevel"/>
     <w:tmpl w:val="B0448EFA"/>
@@ -10019,7 +13746,7 @@
       </w:rPr>
     </w:lvl>
   </w:abstractNum>
-  <w:abstractNum w:abstractNumId="30" w15:restartNumberingAfterBreak="0">
+  <w:abstractNum w:abstractNumId="43" w15:restartNumberingAfterBreak="0">
     <w:nsid w:val="74187D68"/>
     <w:multiLevelType w:val="multilevel"/>
     <w:tmpl w:val="C950ADAC"/>
@@ -10168,7 +13895,7 @@
       </w:rPr>
     </w:lvl>
   </w:abstractNum>
-  <w:abstractNum w:abstractNumId="31" w15:restartNumberingAfterBreak="0">
+  <w:abstractNum w:abstractNumId="44" w15:restartNumberingAfterBreak="0">
     <w:nsid w:val="756B5BD6"/>
     <w:multiLevelType w:val="multilevel"/>
     <w:tmpl w:val="F46A1D7E"/>
@@ -10317,7 +14044,7 @@
       </w:rPr>
     </w:lvl>
   </w:abstractNum>
-  <w:abstractNum w:abstractNumId="32" w15:restartNumberingAfterBreak="0">
+  <w:abstractNum w:abstractNumId="45" w15:restartNumberingAfterBreak="0">
     <w:nsid w:val="75C145A4"/>
     <w:multiLevelType w:val="multilevel"/>
     <w:tmpl w:val="BD26F14C"/>
@@ -10430,7 +14157,7 @@
       </w:pPr>
     </w:lvl>
   </w:abstractNum>
-  <w:abstractNum w:abstractNumId="33" w15:restartNumberingAfterBreak="0">
+  <w:abstractNum w:abstractNumId="46" w15:restartNumberingAfterBreak="0">
     <w:nsid w:val="78996A9A"/>
     <w:multiLevelType w:val="multilevel"/>
     <w:tmpl w:val="B49C7BCE"/>
@@ -10579,7 +14306,156 @@
       </w:rPr>
     </w:lvl>
   </w:abstractNum>
-  <w:abstractNum w:abstractNumId="34" w15:restartNumberingAfterBreak="0">
+  <w:abstractNum w:abstractNumId="47" w15:restartNumberingAfterBreak="0">
+    <w:nsid w:val="7A597B15"/>
+    <w:multiLevelType w:val="multilevel"/>
+    <w:tmpl w:val="57826E52"/>
+    <w:lvl w:ilvl="0">
+      <w:start w:val="1"/>
+      <w:numFmt w:val="bullet"/>
+      <w:lvlText w:val=""/>
+      <w:lvlJc w:val="left"/>
+      <w:pPr>
+        <w:tabs>
+          <w:tab w:val="num" w:pos="720"/>
+        </w:tabs>
+        <w:ind w:left="720" w:hanging="360"/>
+      </w:pPr>
+      <w:rPr>
+        <w:rFonts w:ascii="Symbol" w:hAnsi="Symbol" w:hint="default"/>
+        <w:sz w:val="20"/>
+      </w:rPr>
+    </w:lvl>
+    <w:lvl w:ilvl="1" w:tentative="1">
+      <w:start w:val="1"/>
+      <w:numFmt w:val="bullet"/>
+      <w:lvlText w:val="o"/>
+      <w:lvlJc w:val="left"/>
+      <w:pPr>
+        <w:tabs>
+          <w:tab w:val="num" w:pos="1440"/>
+        </w:tabs>
+        <w:ind w:left="1440" w:hanging="360"/>
+      </w:pPr>
+      <w:rPr>
+        <w:rFonts w:ascii="Courier New" w:hAnsi="Courier New" w:hint="default"/>
+        <w:sz w:val="20"/>
+      </w:rPr>
+    </w:lvl>
+    <w:lvl w:ilvl="2" w:tentative="1">
+      <w:start w:val="1"/>
+      <w:numFmt w:val="bullet"/>
+      <w:lvlText w:val=""/>
+      <w:lvlJc w:val="left"/>
+      <w:pPr>
+        <w:tabs>
+          <w:tab w:val="num" w:pos="2160"/>
+        </w:tabs>
+        <w:ind w:left="2160" w:hanging="360"/>
+      </w:pPr>
+      <w:rPr>
+        <w:rFonts w:ascii="Wingdings" w:hAnsi="Wingdings" w:hint="default"/>
+        <w:sz w:val="20"/>
+      </w:rPr>
+    </w:lvl>
+    <w:lvl w:ilvl="3" w:tentative="1">
+      <w:start w:val="1"/>
+      <w:numFmt w:val="bullet"/>
+      <w:lvlText w:val=""/>
+      <w:lvlJc w:val="left"/>
+      <w:pPr>
+        <w:tabs>
+          <w:tab w:val="num" w:pos="2880"/>
+        </w:tabs>
+        <w:ind w:left="2880" w:hanging="360"/>
+      </w:pPr>
+      <w:rPr>
+        <w:rFonts w:ascii="Wingdings" w:hAnsi="Wingdings" w:hint="default"/>
+        <w:sz w:val="20"/>
+      </w:rPr>
+    </w:lvl>
+    <w:lvl w:ilvl="4" w:tentative="1">
+      <w:start w:val="1"/>
+      <w:numFmt w:val="bullet"/>
+      <w:lvlText w:val=""/>
+      <w:lvlJc w:val="left"/>
+      <w:pPr>
+        <w:tabs>
+          <w:tab w:val="num" w:pos="3600"/>
+        </w:tabs>
+        <w:ind w:left="3600" w:hanging="360"/>
+      </w:pPr>
+      <w:rPr>
+        <w:rFonts w:ascii="Wingdings" w:hAnsi="Wingdings" w:hint="default"/>
+        <w:sz w:val="20"/>
+      </w:rPr>
+    </w:lvl>
+    <w:lvl w:ilvl="5" w:tentative="1">
+      <w:start w:val="1"/>
+      <w:numFmt w:val="bullet"/>
+      <w:lvlText w:val=""/>
+      <w:lvlJc w:val="left"/>
+      <w:pPr>
+        <w:tabs>
+          <w:tab w:val="num" w:pos="4320"/>
+        </w:tabs>
+        <w:ind w:left="4320" w:hanging="360"/>
+      </w:pPr>
+      <w:rPr>
+        <w:rFonts w:ascii="Wingdings" w:hAnsi="Wingdings" w:hint="default"/>
+        <w:sz w:val="20"/>
+      </w:rPr>
+    </w:lvl>
+    <w:lvl w:ilvl="6" w:tentative="1">
+      <w:start w:val="1"/>
+      <w:numFmt w:val="bullet"/>
+      <w:lvlText w:val=""/>
+      <w:lvlJc w:val="left"/>
+      <w:pPr>
+        <w:tabs>
+          <w:tab w:val="num" w:pos="5040"/>
+        </w:tabs>
+        <w:ind w:left="5040" w:hanging="360"/>
+      </w:pPr>
+      <w:rPr>
+        <w:rFonts w:ascii="Wingdings" w:hAnsi="Wingdings" w:hint="default"/>
+        <w:sz w:val="20"/>
+      </w:rPr>
+    </w:lvl>
+    <w:lvl w:ilvl="7" w:tentative="1">
+      <w:start w:val="1"/>
+      <w:numFmt w:val="bullet"/>
+      <w:lvlText w:val=""/>
+      <w:lvlJc w:val="left"/>
+      <w:pPr>
+        <w:tabs>
+          <w:tab w:val="num" w:pos="5760"/>
+        </w:tabs>
+        <w:ind w:left="5760" w:hanging="360"/>
+      </w:pPr>
+      <w:rPr>
+        <w:rFonts w:ascii="Wingdings" w:hAnsi="Wingdings" w:hint="default"/>
+        <w:sz w:val="20"/>
+      </w:rPr>
+    </w:lvl>
+    <w:lvl w:ilvl="8" w:tentative="1">
+      <w:start w:val="1"/>
+      <w:numFmt w:val="bullet"/>
+      <w:lvlText w:val=""/>
+      <w:lvlJc w:val="left"/>
+      <w:pPr>
+        <w:tabs>
+          <w:tab w:val="num" w:pos="6480"/>
+        </w:tabs>
+        <w:ind w:left="6480" w:hanging="360"/>
+      </w:pPr>
+      <w:rPr>
+        <w:rFonts w:ascii="Wingdings" w:hAnsi="Wingdings" w:hint="default"/>
+        <w:sz w:val="20"/>
+      </w:rPr>
+    </w:lvl>
+  </w:abstractNum>
+  <w:abstractNum w:abstractNumId="48" w15:restartNumberingAfterBreak="0">
     <w:nsid w:val="7A613320"/>
     <w:multiLevelType w:val="multilevel"/>
     <w:tmpl w:val="3CE0BB3A"/>
@@ -10728,7 +14604,7 @@
       </w:rPr>
     </w:lvl>
   </w:abstractNum>
-  <w:abstractNum w:abstractNumId="35" w15:restartNumberingAfterBreak="0">
+  <w:abstractNum w:abstractNumId="49" w15:restartNumberingAfterBreak="0">
     <w:nsid w:val="7C8D7547"/>
     <w:multiLevelType w:val="multilevel"/>
     <w:tmpl w:val="EF787098"/>
@@ -10877,7 +14753,156 @@
       </w:rPr>
     </w:lvl>
   </w:abstractNum>
-  <w:abstractNum w:abstractNumId="36" w15:restartNumberingAfterBreak="0">
+  <w:abstractNum w:abstractNumId="50" w15:restartNumberingAfterBreak="0">
+    <w:nsid w:val="7D4635CF"/>
+    <w:multiLevelType w:val="multilevel"/>
+    <w:tmpl w:val="12E09DF6"/>
+    <w:lvl w:ilvl="0">
+      <w:start w:val="1"/>
+      <w:numFmt w:val="bullet"/>
+      <w:lvlText w:val=""/>
+      <w:lvlJc w:val="left"/>
+      <w:pPr>
+        <w:tabs>
+          <w:tab w:val="num" w:pos="720"/>
+        </w:tabs>
+        <w:ind w:left="720" w:hanging="360"/>
+      </w:pPr>
+      <w:rPr>
+        <w:rFonts w:ascii="Symbol" w:hAnsi="Symbol" w:hint="default"/>
+        <w:sz w:val="20"/>
+      </w:rPr>
+    </w:lvl>
+    <w:lvl w:ilvl="1">
+      <w:start w:val="1"/>
+      <w:numFmt w:val="bullet"/>
+      <w:lvlText w:val="o"/>
+      <w:lvlJc w:val="left"/>
+      <w:pPr>
+        <w:tabs>
+          <w:tab w:val="num" w:pos="1440"/>
+        </w:tabs>
+        <w:ind w:left="1440" w:hanging="360"/>
+      </w:pPr>
+      <w:rPr>
+        <w:rFonts w:ascii="Courier New" w:hAnsi="Courier New" w:hint="default"/>
+        <w:sz w:val="20"/>
+      </w:rPr>
+    </w:lvl>
+    <w:lvl w:ilvl="2" w:tentative="1">
+      <w:start w:val="1"/>
+      <w:numFmt w:val="bullet"/>
+      <w:lvlText w:val=""/>
+      <w:lvlJc w:val="left"/>
+      <w:pPr>
+        <w:tabs>
+          <w:tab w:val="num" w:pos="2160"/>
+        </w:tabs>
+        <w:ind w:left="2160" w:hanging="360"/>
+      </w:pPr>
+      <w:rPr>
+        <w:rFonts w:ascii="Wingdings" w:hAnsi="Wingdings" w:hint="default"/>
+        <w:sz w:val="20"/>
+      </w:rPr>
+    </w:lvl>
+    <w:lvl w:ilvl="3" w:tentative="1">
+      <w:start w:val="1"/>
+      <w:numFmt w:val="bullet"/>
+      <w:lvlText w:val=""/>
+      <w:lvlJc w:val="left"/>
+      <w:pPr>
+        <w:tabs>
+          <w:tab w:val="num" w:pos="2880"/>
+        </w:tabs>
+        <w:ind w:left="2880" w:hanging="360"/>
+      </w:pPr>
+      <w:rPr>
+        <w:rFonts w:ascii="Wingdings" w:hAnsi="Wingdings" w:hint="default"/>
+        <w:sz w:val="20"/>
+      </w:rPr>
+    </w:lvl>
+    <w:lvl w:ilvl="4" w:tentative="1">
+      <w:start w:val="1"/>
+      <w:numFmt w:val="bullet"/>
+      <w:lvlText w:val=""/>
+      <w:lvlJc w:val="left"/>
+      <w:pPr>
+        <w:tabs>
+          <w:tab w:val="num" w:pos="3600"/>
+        </w:tabs>
+        <w:ind w:left="3600" w:hanging="360"/>
+      </w:pPr>
+      <w:rPr>
+        <w:rFonts w:ascii="Wingdings" w:hAnsi="Wingdings" w:hint="default"/>
+        <w:sz w:val="20"/>
+      </w:rPr>
+    </w:lvl>
+    <w:lvl w:ilvl="5" w:tentative="1">
+      <w:start w:val="1"/>
+      <w:numFmt w:val="bullet"/>
+      <w:lvlText w:val=""/>
+      <w:lvlJc w:val="left"/>
+      <w:pPr>
+        <w:tabs>
+          <w:tab w:val="num" w:pos="4320"/>
+        </w:tabs>
+        <w:ind w:left="4320" w:hanging="360"/>
+      </w:pPr>
+      <w:rPr>
+        <w:rFonts w:ascii="Wingdings" w:hAnsi="Wingdings" w:hint="default"/>
+        <w:sz w:val="20"/>
+      </w:rPr>
+    </w:lvl>
+    <w:lvl w:ilvl="6" w:tentative="1">
+      <w:start w:val="1"/>
+      <w:numFmt w:val="bullet"/>
+      <w:lvlText w:val=""/>
+      <w:lvlJc w:val="left"/>
+      <w:pPr>
+        <w:tabs>
+          <w:tab w:val="num" w:pos="5040"/>
+        </w:tabs>
+        <w:ind w:left="5040" w:hanging="360"/>
+      </w:pPr>
+      <w:rPr>
+        <w:rFonts w:ascii="Wingdings" w:hAnsi="Wingdings" w:hint="default"/>
+        <w:sz w:val="20"/>
+      </w:rPr>
+    </w:lvl>
+    <w:lvl w:ilvl="7" w:tentative="1">
+      <w:start w:val="1"/>
+      <w:numFmt w:val="bullet"/>
+      <w:lvlText w:val=""/>
+      <w:lvlJc w:val="left"/>
+      <w:pPr>
+        <w:tabs>
+          <w:tab w:val="num" w:pos="5760"/>
+        </w:tabs>
+        <w:ind w:left="5760" w:hanging="360"/>
+      </w:pPr>
+      <w:rPr>
+        <w:rFonts w:ascii="Wingdings" w:hAnsi="Wingdings" w:hint="default"/>
+        <w:sz w:val="20"/>
+      </w:rPr>
+    </w:lvl>
+    <w:lvl w:ilvl="8" w:tentative="1">
+      <w:start w:val="1"/>
+      <w:numFmt w:val="bullet"/>
+      <w:lvlText w:val=""/>
+      <w:lvlJc w:val="left"/>
+      <w:pPr>
+        <w:tabs>
+          <w:tab w:val="num" w:pos="6480"/>
+        </w:tabs>
+        <w:ind w:left="6480" w:hanging="360"/>
+      </w:pPr>
+      <w:rPr>
+        <w:rFonts w:ascii="Wingdings" w:hAnsi="Wingdings" w:hint="default"/>
+        <w:sz w:val="20"/>
+      </w:rPr>
+    </w:lvl>
+  </w:abstractNum>
+  <w:abstractNum w:abstractNumId="51" w15:restartNumberingAfterBreak="0">
     <w:nsid w:val="7FC91198"/>
     <w:multiLevelType w:val="multilevel"/>
     <w:tmpl w:val="4F2A53EE"/>
@@ -11026,7 +15051,7 @@
       </w:rPr>
     </w:lvl>
   </w:abstractNum>
-  <w:abstractNum w:abstractNumId="37" w15:restartNumberingAfterBreak="0">
+  <w:abstractNum w:abstractNumId="52" w15:restartNumberingAfterBreak="0">
     <w:nsid w:val="7FFD6BC1"/>
     <w:multiLevelType w:val="multilevel"/>
     <w:tmpl w:val="0D54B5C0"/>
@@ -11176,112 +15201,112 @@
     </w:lvl>
   </w:abstractNum>
   <w:num w:numId="1" w16cid:durableId="2060353131">
-    <w:abstractNumId w:val="28"/>
+    <w:abstractNumId w:val="41"/>
   </w:num>
   <w:num w:numId="2" w16cid:durableId="1150515194">
-    <w:abstractNumId w:val="5"/>
+    <w:abstractNumId w:val="11"/>
   </w:num>
   <w:num w:numId="3" w16cid:durableId="467555199">
-    <w:abstractNumId w:val="30"/>
+    <w:abstractNumId w:val="43"/>
   </w:num>
   <w:num w:numId="4" w16cid:durableId="1909488916">
-    <w:abstractNumId w:val="15"/>
+    <w:abstractNumId w:val="27"/>
   </w:num>
   <w:num w:numId="5" w16cid:durableId="432362651">
-    <w:abstractNumId w:val="9"/>
+    <w:abstractNumId w:val="18"/>
   </w:num>
   <w:num w:numId="6" w16cid:durableId="1431658571">
     <w:abstractNumId w:val="1"/>
   </w:num>
   <w:num w:numId="7" w16cid:durableId="1286110350">
+    <w:abstractNumId w:val="42"/>
+  </w:num>
+  <w:num w:numId="8" w16cid:durableId="1525096605">
+    <w:abstractNumId w:val="28"/>
+  </w:num>
+  <w:num w:numId="9" w16cid:durableId="2125079103">
     <w:abstractNumId w:val="29"/>
   </w:num>
-  <w:num w:numId="8" w16cid:durableId="1525096605">
-    <w:abstractNumId w:val="16"/>
-  </w:num>
-  <w:num w:numId="9" w16cid:durableId="2125079103">
-    <w:abstractNumId w:val="17"/>
-  </w:num>
   <w:num w:numId="10" w16cid:durableId="18170841">
-    <w:abstractNumId w:val="6"/>
+    <w:abstractNumId w:val="12"/>
   </w:num>
   <w:num w:numId="11" w16cid:durableId="1683509751">
-    <w:abstractNumId w:val="4"/>
+    <w:abstractNumId w:val="9"/>
   </w:num>
   <w:num w:numId="12" w16cid:durableId="1341352337">
-    <w:abstractNumId w:val="13"/>
+    <w:abstractNumId w:val="24"/>
   </w:num>
   <w:num w:numId="13" w16cid:durableId="964194191">
-    <w:abstractNumId w:val="11"/>
+    <w:abstractNumId w:val="20"/>
   </w:num>
   <w:num w:numId="14" w16cid:durableId="1261988576">
     <w:abstractNumId w:val="0"/>
   </w:num>
   <w:num w:numId="15" w16cid:durableId="1609922482">
-    <w:abstractNumId w:val="23"/>
+    <w:abstractNumId w:val="35"/>
   </w:num>
   <w:num w:numId="16" w16cid:durableId="1770344479">
-    <w:abstractNumId w:val="8"/>
+    <w:abstractNumId w:val="17"/>
   </w:num>
   <w:num w:numId="17" w16cid:durableId="1199659529">
+    <w:abstractNumId w:val="45"/>
+  </w:num>
+  <w:num w:numId="18" w16cid:durableId="980382740">
+    <w:abstractNumId w:val="33"/>
+  </w:num>
+  <w:num w:numId="19" w16cid:durableId="1658534420">
+    <w:abstractNumId w:val="44"/>
+  </w:num>
+  <w:num w:numId="20" w16cid:durableId="53163121">
+    <w:abstractNumId w:val="25"/>
+  </w:num>
+  <w:num w:numId="21" w16cid:durableId="583297828">
+    <w:abstractNumId w:val="51"/>
+  </w:num>
+  <w:num w:numId="22" w16cid:durableId="607153749">
+    <w:abstractNumId w:val="5"/>
+  </w:num>
+  <w:num w:numId="23" w16cid:durableId="1868906956">
+    <w:abstractNumId w:val="49"/>
+  </w:num>
+  <w:num w:numId="24" w16cid:durableId="240651060">
+    <w:abstractNumId w:val="52"/>
+  </w:num>
+  <w:num w:numId="25" w16cid:durableId="2116316282">
+    <w:abstractNumId w:val="4"/>
+  </w:num>
+  <w:num w:numId="26" w16cid:durableId="2113282379">
+    <w:abstractNumId w:val="22"/>
+  </w:num>
+  <w:num w:numId="27" w16cid:durableId="1774664517">
+    <w:abstractNumId w:val="36"/>
+  </w:num>
+  <w:num w:numId="28" w16cid:durableId="17245017">
+    <w:abstractNumId w:val="46"/>
+  </w:num>
+  <w:num w:numId="29" w16cid:durableId="223759170">
+    <w:abstractNumId w:val="31"/>
+  </w:num>
+  <w:num w:numId="30" w16cid:durableId="1333559163">
+    <w:abstractNumId w:val="34"/>
+  </w:num>
+  <w:num w:numId="31" w16cid:durableId="436104371">
     <w:abstractNumId w:val="32"/>
   </w:num>
-  <w:num w:numId="18" w16cid:durableId="980382740">
-    <w:abstractNumId w:val="21"/>
+  <w:num w:numId="32" w16cid:durableId="1499929107">
+    <w:abstractNumId w:val="30"/>
   </w:num>
-  <w:num w:numId="19" w16cid:durableId="1658534420">
-    <w:abstractNumId w:val="31"/>
+  <w:num w:numId="33" w16cid:durableId="530217984">
+    <w:abstractNumId w:val="48"/>
   </w:num>
-  <w:num w:numId="20" w16cid:durableId="53163121">
-    <w:abstractNumId w:val="14"/>
+  <w:num w:numId="34" w16cid:durableId="214128330">
+    <w:abstractNumId w:val="40"/>
   </w:num>
-  <w:num w:numId="21" w16cid:durableId="583297828">
-    <w:abstractNumId w:val="36"/>
-  </w:num>
-  <w:num w:numId="22" w16cid:durableId="607153749">
-    <w:abstractNumId w:val="3"/>
-  </w:num>
-  <w:num w:numId="23" w16cid:durableId="1868906956">
-    <w:abstractNumId w:val="35"/>
-  </w:num>
-  <w:num w:numId="24" w16cid:durableId="240651060">
-    <w:abstractNumId w:val="37"/>
-  </w:num>
-  <w:num w:numId="25" w16cid:durableId="2116316282">
-    <w:abstractNumId w:val="2"/>
-  </w:num>
-  <w:num w:numId="26" w16cid:durableId="2113282379">
-    <w:abstractNumId w:val="12"/>
-  </w:num>
-  <w:num w:numId="27" w16cid:durableId="1774664517">
-    <w:abstractNumId w:val="24"/>
-  </w:num>
-  <w:num w:numId="28" w16cid:durableId="17245017">
-    <w:abstractNumId w:val="33"/>
-  </w:num>
-  <w:num w:numId="29" w16cid:durableId="223759170">
+  <w:num w:numId="35" w16cid:durableId="1241407924">
     <w:abstractNumId w:val="19"/>
   </w:num>
-  <w:num w:numId="30" w16cid:durableId="1333559163">
-    <w:abstractNumId w:val="22"/>
-  </w:num>
-  <w:num w:numId="31" w16cid:durableId="436104371">
-    <w:abstractNumId w:val="20"/>
-  </w:num>
-  <w:num w:numId="32" w16cid:durableId="1499929107">
-    <w:abstractNumId w:val="18"/>
-  </w:num>
-  <w:num w:numId="33" w16cid:durableId="530217984">
-    <w:abstractNumId w:val="34"/>
-  </w:num>
-  <w:num w:numId="34" w16cid:durableId="214128330">
-    <w:abstractNumId w:val="27"/>
-  </w:num>
-  <w:num w:numId="35" w16cid:durableId="1241407924">
-    <w:abstractNumId w:val="10"/>
-  </w:num>
   <w:num w:numId="36" w16cid:durableId="581836196">
-    <w:abstractNumId w:val="10"/>
+    <w:abstractNumId w:val="19"/>
     <w:lvlOverride w:ilvl="1">
       <w:lvl w:ilvl="1">
         <w:numFmt w:val="decimal"/>
@@ -11291,13 +15316,58 @@
     </w:lvlOverride>
   </w:num>
   <w:num w:numId="37" w16cid:durableId="1786460840">
+    <w:abstractNumId w:val="38"/>
+  </w:num>
+  <w:num w:numId="38" w16cid:durableId="149953968">
+    <w:abstractNumId w:val="37"/>
+  </w:num>
+  <w:num w:numId="39" w16cid:durableId="2119400096">
+    <w:abstractNumId w:val="13"/>
+  </w:num>
+  <w:num w:numId="40" w16cid:durableId="199704812">
+    <w:abstractNumId w:val="2"/>
+  </w:num>
+  <w:num w:numId="41" w16cid:durableId="882449792">
+    <w:abstractNumId w:val="39"/>
+  </w:num>
+  <w:num w:numId="42" w16cid:durableId="1109158430">
+    <w:abstractNumId w:val="50"/>
+  </w:num>
+  <w:num w:numId="43" w16cid:durableId="897207511">
+    <w:abstractNumId w:val="23"/>
+  </w:num>
+  <w:num w:numId="44" w16cid:durableId="828133295">
+    <w:abstractNumId w:val="3"/>
+  </w:num>
+  <w:num w:numId="45" w16cid:durableId="624459596">
+    <w:abstractNumId w:val="14"/>
+  </w:num>
+  <w:num w:numId="46" w16cid:durableId="48917635">
     <w:abstractNumId w:val="26"/>
   </w:num>
-  <w:num w:numId="38" w16cid:durableId="149953968">
-    <w:abstractNumId w:val="25"/>
+  <w:num w:numId="47" w16cid:durableId="1117990629">
+    <w:abstractNumId w:val="15"/>
   </w:num>
-  <w:num w:numId="39" w16cid:durableId="2119400096">
+  <w:num w:numId="48" w16cid:durableId="2072994293">
+    <w:abstractNumId w:val="21"/>
+  </w:num>
+  <w:num w:numId="49" w16cid:durableId="84302664">
+    <w:abstractNumId w:val="16"/>
+  </w:num>
+  <w:num w:numId="50" w16cid:durableId="23287066">
+    <w:abstractNumId w:val="8"/>
+  </w:num>
+  <w:num w:numId="51" w16cid:durableId="469520846">
     <w:abstractNumId w:val="7"/>
+  </w:num>
+  <w:num w:numId="52" w16cid:durableId="513881238">
+    <w:abstractNumId w:val="10"/>
+  </w:num>
+  <w:num w:numId="53" w16cid:durableId="625702706">
+    <w:abstractNumId w:val="6"/>
+  </w:num>
+  <w:num w:numId="54" w16cid:durableId="1482189000">
+    <w:abstractNumId w:val="47"/>
   </w:num>
 </w:numbering>
 </file>

</xml_diff>